<commit_message>
vault backup: 2026-09-18 03:53:30
</commit_message>
<xml_diff>
--- a/Учеба 4 семестр/ОСИ/3 ЛАБ/Отчет.docx
+++ b/Учеба 4 семестр/ОСИ/3 ЛАБ/Отчет.docx
@@ -2519,8 +2519,1286 @@
     <w:p>
       <w:pPr>
         <w:pStyle w:val="ac"/>
-        <w:spacing w:before="183" w:line="309" w:lineRule="auto"/>
-        <w:ind w:right="163"/>
+        <w:numPr>
+          <w:ilvl w:val="1"/>
+          <w:numId w:val="2"/>
+        </w:numPr>
+        <w:spacing w:before="183" w:line="309" w:lineRule="auto"/>
+        <w:ind w:right="163"/>
+      </w:pPr>
+      <w:proofErr w:type="spellStart"/>
+      <w:r>
+        <w:rPr>
+          <w:lang w:val="en-US"/>
+        </w:rPr>
+        <w:t>QuickSort</w:t>
+      </w:r>
+      <w:proofErr w:type="spellEnd"/>
+    </w:p>
+    <w:p>
+      <w:pPr>
+        <w:pStyle w:val="ac"/>
+        <w:spacing w:before="183" w:line="309" w:lineRule="auto"/>
+        <w:ind w:right="163"/>
+      </w:pPr>
+      <w:r>
+        <w:t xml:space="preserve">Программа должна выполнить многопоточную быструю сортировку массива целых чисел по </w:t>
+      </w:r>
+      <w:proofErr w:type="spellStart"/>
+      <w:r>
+        <w:t>возростанию</w:t>
+      </w:r>
+      <w:proofErr w:type="spellEnd"/>
+      <w:r>
+        <w:t>.</w:t>
+      </w:r>
+    </w:p>
+    <w:p>
+      <w:pPr>
+        <w:pStyle w:val="ac"/>
+        <w:spacing w:before="183" w:line="309" w:lineRule="auto"/>
+        <w:ind w:right="163"/>
+      </w:pPr>
+      <w:r>
+        <w:t xml:space="preserve">Пример быстрой сортировки: </w:t>
+      </w:r>
+      <w:r>
+        <w:rPr>
+          <w:noProof/>
+        </w:rPr>
+        <w:drawing>
+          <wp:inline distT="0" distB="0" distL="0" distR="0" wp14:anchorId="30DA8254" wp14:editId="6F5EE583">
+            <wp:extent cx="5493385" cy="3907155"/>
+            <wp:effectExtent l="0" t="0" r="0" b="0"/>
+            <wp:docPr id="5" name="Рисунок 5" descr="Это база. Алгоритмы сортировки для начинающих / Хабр"/>
+            <wp:cNvGraphicFramePr>
+              <a:graphicFrameLocks xmlns:a="http://schemas.openxmlformats.org/drawingml/2006/main" noChangeAspect="1"/>
+            </wp:cNvGraphicFramePr>
+            <a:graphic xmlns:a="http://schemas.openxmlformats.org/drawingml/2006/main">
+              <a:graphicData uri="http://schemas.openxmlformats.org/drawingml/2006/picture">
+                <pic:pic xmlns:pic="http://schemas.openxmlformats.org/drawingml/2006/picture">
+                  <pic:nvPicPr>
+                    <pic:cNvPr id="0" name="Picture 5" descr="Это база. Алгоритмы сортировки для начинающих / Хабр"/>
+                    <pic:cNvPicPr>
+                      <a:picLocks noChangeAspect="1" noChangeArrowheads="1"/>
+                    </pic:cNvPicPr>
+                  </pic:nvPicPr>
+                  <pic:blipFill>
+                    <a:blip r:embed="rId8">
+                      <a:extLst>
+                        <a:ext uri="{28A0092B-C50C-407E-A947-70E740481C1C}">
+                          <a14:useLocalDpi xmlns:a14="http://schemas.microsoft.com/office/drawing/2010/main" val="0"/>
+                        </a:ext>
+                      </a:extLst>
+                    </a:blip>
+                    <a:srcRect/>
+                    <a:stretch>
+                      <a:fillRect/>
+                    </a:stretch>
+                  </pic:blipFill>
+                  <pic:spPr bwMode="auto">
+                    <a:xfrm>
+                      <a:off x="0" y="0"/>
+                      <a:ext cx="5493385" cy="3907155"/>
+                    </a:xfrm>
+                    <a:prstGeom prst="rect">
+                      <a:avLst/>
+                    </a:prstGeom>
+                    <a:noFill/>
+                    <a:ln>
+                      <a:noFill/>
+                    </a:ln>
+                  </pic:spPr>
+                </pic:pic>
+              </a:graphicData>
+            </a:graphic>
+          </wp:inline>
+        </w:drawing>
+      </w:r>
+    </w:p>
+    <w:p>
+      <w:pPr>
+        <w:pStyle w:val="ac"/>
+        <w:spacing w:before="183" w:line="309" w:lineRule="auto"/>
+        <w:ind w:right="163"/>
+        <w:jc w:val="center"/>
+      </w:pPr>
+      <w:r>
+        <w:t>Рисунок 4. Пример быстрой сортировки</w:t>
+      </w:r>
+    </w:p>
+    <w:p>
+      <w:pPr>
+        <w:pStyle w:val="ac"/>
+        <w:spacing w:before="183" w:line="309" w:lineRule="auto"/>
+        <w:ind w:right="163"/>
+      </w:pPr>
+      <w:r>
+        <w:lastRenderedPageBreak/>
+        <w:t xml:space="preserve">Описание алгоритма: </w:t>
+      </w:r>
+    </w:p>
+    <w:p>
+      <w:pPr>
+        <w:pStyle w:val="ac"/>
+        <w:numPr>
+          <w:ilvl w:val="0"/>
+          <w:numId w:val="14"/>
+        </w:numPr>
+        <w:spacing w:before="183" w:line="309" w:lineRule="auto"/>
+        <w:ind w:right="163"/>
+      </w:pPr>
+      <w:r>
+        <w:t>Получение параметров из входного файла</w:t>
+      </w:r>
+    </w:p>
+    <w:p>
+      <w:pPr>
+        <w:pStyle w:val="ac"/>
+        <w:numPr>
+          <w:ilvl w:val="0"/>
+          <w:numId w:val="14"/>
+        </w:numPr>
+        <w:spacing w:before="183" w:line="309" w:lineRule="auto"/>
+        <w:ind w:right="163"/>
+      </w:pPr>
+      <w:r>
+        <w:t xml:space="preserve">Создается очередь задач, объекты синхронизации </w:t>
+      </w:r>
+      <w:r>
+        <w:rPr>
+          <w:lang w:val="en-US"/>
+        </w:rPr>
+        <w:t>mutex</w:t>
+      </w:r>
+      <w:r>
+        <w:t xml:space="preserve">, </w:t>
+      </w:r>
+      <w:r>
+        <w:rPr>
+          <w:lang w:val="en-US"/>
+        </w:rPr>
+        <w:t>event</w:t>
+      </w:r>
+      <w:r>
+        <w:t xml:space="preserve">. </w:t>
+      </w:r>
+    </w:p>
+    <w:p>
+      <w:pPr>
+        <w:pStyle w:val="ac"/>
+        <w:numPr>
+          <w:ilvl w:val="0"/>
+          <w:numId w:val="14"/>
+        </w:numPr>
+        <w:spacing w:before="183" w:line="309" w:lineRule="auto"/>
+        <w:ind w:right="163"/>
+      </w:pPr>
+      <w:r>
+        <w:t>Создается первая задача, отсортировать весь массив</w:t>
+      </w:r>
+    </w:p>
+    <w:p>
+      <w:pPr>
+        <w:pStyle w:val="ac"/>
+        <w:numPr>
+          <w:ilvl w:val="0"/>
+          <w:numId w:val="14"/>
+        </w:numPr>
+        <w:spacing w:before="183" w:line="309" w:lineRule="auto"/>
+        <w:ind w:right="163"/>
+      </w:pPr>
+      <w:r>
+        <w:t>Создаются потоки, запускается таймер</w:t>
+      </w:r>
+    </w:p>
+    <w:p>
+      <w:pPr>
+        <w:pStyle w:val="ac"/>
+        <w:numPr>
+          <w:ilvl w:val="0"/>
+          <w:numId w:val="14"/>
+        </w:numPr>
+        <w:spacing w:before="183" w:line="309" w:lineRule="auto"/>
+        <w:ind w:right="163"/>
+      </w:pPr>
+      <w:r>
+        <w:t xml:space="preserve">Под </w:t>
+      </w:r>
+      <w:r>
+        <w:rPr>
+          <w:lang w:val="en-US"/>
+        </w:rPr>
+        <w:t>mutex</w:t>
+      </w:r>
+      <w:r>
+        <w:t xml:space="preserve"> поток берет задачу, если размер массива больше 1000 задача делится, иначе поток сортирует самостоятельно. </w:t>
+      </w:r>
+    </w:p>
+    <w:p>
+      <w:pPr>
+        <w:pStyle w:val="ac"/>
+        <w:numPr>
+          <w:ilvl w:val="0"/>
+          <w:numId w:val="14"/>
+        </w:numPr>
+        <w:spacing w:before="183" w:line="309" w:lineRule="auto"/>
+        <w:ind w:right="163"/>
+      </w:pPr>
+      <w:r>
+        <w:t xml:space="preserve">Если очередь пуста выполняется </w:t>
+      </w:r>
+      <w:r>
+        <w:rPr>
+          <w:lang w:val="en-US"/>
+        </w:rPr>
+        <w:t>done</w:t>
+      </w:r>
+      <w:r>
+        <w:t>_</w:t>
+      </w:r>
+      <w:r>
+        <w:rPr>
+          <w:lang w:val="en-US"/>
+        </w:rPr>
+        <w:t>event</w:t>
+      </w:r>
+      <w:r>
+        <w:t xml:space="preserve"> </w:t>
+      </w:r>
+    </w:p>
+    <w:p>
+      <w:pPr>
+        <w:pStyle w:val="ac"/>
+        <w:numPr>
+          <w:ilvl w:val="0"/>
+          <w:numId w:val="14"/>
+        </w:numPr>
+        <w:spacing w:before="183" w:line="309" w:lineRule="auto"/>
+        <w:ind w:right="163"/>
+      </w:pPr>
+      <w:r>
+        <w:t xml:space="preserve">Окончание замера времени, запись в файл, освобождение ресурсов </w:t>
+      </w:r>
+      <w:r>
+        <w:rPr>
+          <w:noProof/>
+        </w:rPr>
+        <w:lastRenderedPageBreak/>
+        <w:drawing>
+          <wp:inline distT="0" distB="0" distL="0" distR="0" wp14:anchorId="077FC5A0" wp14:editId="2300373F">
+            <wp:extent cx="5576321" cy="8499764"/>
+            <wp:effectExtent l="0" t="0" r="5715" b="0"/>
+            <wp:docPr id="4" name="Рисунок 4"/>
+            <wp:cNvGraphicFramePr>
+              <a:graphicFrameLocks xmlns:a="http://schemas.openxmlformats.org/drawingml/2006/main" noChangeAspect="1"/>
+            </wp:cNvGraphicFramePr>
+            <a:graphic xmlns:a="http://schemas.openxmlformats.org/drawingml/2006/main">
+              <a:graphicData uri="http://schemas.openxmlformats.org/drawingml/2006/picture">
+                <pic:pic xmlns:pic="http://schemas.openxmlformats.org/drawingml/2006/picture">
+                  <pic:nvPicPr>
+                    <pic:cNvPr id="0" name="Picture 4"/>
+                    <pic:cNvPicPr>
+                      <a:picLocks noChangeAspect="1" noChangeArrowheads="1"/>
+                    </pic:cNvPicPr>
+                  </pic:nvPicPr>
+                  <pic:blipFill rotWithShape="1">
+                    <a:blip r:embed="rId9" cstate="print">
+                      <a:extLst>
+                        <a:ext uri="{28A0092B-C50C-407E-A947-70E740481C1C}">
+                          <a14:useLocalDpi xmlns:a14="http://schemas.microsoft.com/office/drawing/2010/main" val="0"/>
+                        </a:ext>
+                      </a:extLst>
+                    </a:blip>
+                    <a:srcRect t="2172"/>
+                    <a:stretch/>
+                  </pic:blipFill>
+                  <pic:spPr bwMode="auto">
+                    <a:xfrm>
+                      <a:off x="0" y="0"/>
+                      <a:ext cx="5581588" cy="8507793"/>
+                    </a:xfrm>
+                    <a:prstGeom prst="rect">
+                      <a:avLst/>
+                    </a:prstGeom>
+                    <a:noFill/>
+                    <a:ln>
+                      <a:noFill/>
+                    </a:ln>
+                    <a:extLst>
+                      <a:ext uri="{53640926-AAD7-44D8-BBD7-CCE9431645EC}">
+                        <a14:shadowObscured xmlns:a14="http://schemas.microsoft.com/office/drawing/2010/main"/>
+                      </a:ext>
+                    </a:extLst>
+                  </pic:spPr>
+                </pic:pic>
+              </a:graphicData>
+            </a:graphic>
+          </wp:inline>
+        </w:drawing>
+      </w:r>
+    </w:p>
+    <w:p>
+      <w:pPr>
+        <w:pStyle w:val="ac"/>
+        <w:spacing w:before="183" w:line="309" w:lineRule="auto"/>
+        <w:ind w:left="720" w:right="163"/>
+        <w:jc w:val="center"/>
+      </w:pPr>
+      <w:r>
+        <w:t xml:space="preserve">Рисунок </w:t>
+      </w:r>
+      <w:r>
+        <w:t>5</w:t>
+      </w:r>
+      <w:r>
+        <w:t>. Блок-схема алгоритма</w:t>
+      </w:r>
+    </w:p>
+    <w:p>
+      <w:pPr>
+        <w:pStyle w:val="ac"/>
+        <w:spacing w:before="183" w:line="309" w:lineRule="auto"/>
+        <w:ind w:left="720" w:right="163"/>
+      </w:pPr>
+      <w:r>
+        <w:lastRenderedPageBreak/>
+        <w:drawing>
+          <wp:inline distT="0" distB="0" distL="0" distR="0" wp14:anchorId="1C2BA934" wp14:editId="440A7EC9">
+            <wp:extent cx="5216911" cy="2087880"/>
+            <wp:effectExtent l="0" t="0" r="3175" b="7620"/>
+            <wp:docPr id="9" name="Рисунок 9"/>
+            <wp:cNvGraphicFramePr>
+              <a:graphicFrameLocks xmlns:a="http://schemas.openxmlformats.org/drawingml/2006/main" noChangeAspect="1"/>
+            </wp:cNvGraphicFramePr>
+            <a:graphic xmlns:a="http://schemas.openxmlformats.org/drawingml/2006/main">
+              <a:graphicData uri="http://schemas.openxmlformats.org/drawingml/2006/picture">
+                <pic:pic xmlns:pic="http://schemas.openxmlformats.org/drawingml/2006/picture">
+                  <pic:nvPicPr>
+                    <pic:cNvPr id="0" name="Picture 14"/>
+                    <pic:cNvPicPr>
+                      <a:picLocks noChangeAspect="1" noChangeArrowheads="1"/>
+                    </pic:cNvPicPr>
+                  </pic:nvPicPr>
+                  <pic:blipFill rotWithShape="1">
+                    <a:blip r:embed="rId10" cstate="print">
+                      <a:extLst>
+                        <a:ext uri="{28A0092B-C50C-407E-A947-70E740481C1C}">
+                          <a14:useLocalDpi xmlns:a14="http://schemas.microsoft.com/office/drawing/2010/main" val="0"/>
+                        </a:ext>
+                      </a:extLst>
+                    </a:blip>
+                    <a:srcRect b="9587"/>
+                    <a:stretch/>
+                  </pic:blipFill>
+                  <pic:spPr bwMode="auto">
+                    <a:xfrm>
+                      <a:off x="0" y="0"/>
+                      <a:ext cx="5229417" cy="2092885"/>
+                    </a:xfrm>
+                    <a:prstGeom prst="rect">
+                      <a:avLst/>
+                    </a:prstGeom>
+                    <a:noFill/>
+                    <a:ln>
+                      <a:noFill/>
+                    </a:ln>
+                    <a:extLst>
+                      <a:ext uri="{53640926-AAD7-44D8-BBD7-CCE9431645EC}">
+                        <a14:shadowObscured xmlns:a14="http://schemas.microsoft.com/office/drawing/2010/main"/>
+                      </a:ext>
+                    </a:extLst>
+                  </pic:spPr>
+                </pic:pic>
+              </a:graphicData>
+            </a:graphic>
+          </wp:inline>
+        </w:drawing>
+      </w:r>
+    </w:p>
+    <w:p>
+      <w:pPr>
+        <w:pStyle w:val="ac"/>
+        <w:spacing w:before="183" w:line="309" w:lineRule="auto"/>
+        <w:ind w:left="720" w:right="163"/>
+        <w:jc w:val="center"/>
+      </w:pPr>
+      <w:r>
+        <w:t>Рисунок 6. Временная диаграмма потоков</w:t>
+      </w:r>
+    </w:p>
+    <w:p>
+      <w:pPr>
+        <w:pStyle w:val="ac"/>
+        <w:numPr>
+          <w:ilvl w:val="1"/>
+          <w:numId w:val="2"/>
+        </w:numPr>
+        <w:spacing w:before="183" w:line="309" w:lineRule="auto"/>
+        <w:ind w:right="163"/>
+      </w:pPr>
+      <w:proofErr w:type="spellStart"/>
+      <w:r>
+        <w:rPr>
+          <w:lang w:val="en-US"/>
+        </w:rPr>
+        <w:t>MergeSort</w:t>
+      </w:r>
+      <w:proofErr w:type="spellEnd"/>
+      <w:r>
+        <w:rPr>
+          <w:lang w:val="en-US"/>
+        </w:rPr>
+        <w:t xml:space="preserve"> </w:t>
+      </w:r>
+    </w:p>
+    <w:p>
+      <w:pPr>
+        <w:pStyle w:val="ac"/>
+        <w:spacing w:before="183" w:line="309" w:lineRule="auto"/>
+        <w:ind w:right="163"/>
+      </w:pPr>
+      <w:r>
+        <w:t xml:space="preserve">Сортировка слияниями должна быть реализована по тем же принципам, что и быстрая сортировка. </w:t>
+      </w:r>
+      <w:r>
+        <w:t>Алгоритм делит массив на две части, рекурсивно сортирует каждую из них, а затем объединяет их в один отсортированный массив.</w:t>
+      </w:r>
+    </w:p>
+    <w:p>
+      <w:pPr>
+        <w:pStyle w:val="ac"/>
+        <w:spacing w:before="183" w:line="309" w:lineRule="auto"/>
+        <w:ind w:right="163"/>
+        <w:jc w:val="center"/>
+      </w:pPr>
+      <w:r>
+        <w:rPr>
+          <w:noProof/>
+        </w:rPr>
+        <w:drawing>
+          <wp:inline distT="0" distB="0" distL="0" distR="0" wp14:anchorId="4F5828DE" wp14:editId="071A7347">
+            <wp:extent cx="3948546" cy="3796038"/>
+            <wp:effectExtent l="0" t="0" r="0" b="0"/>
+            <wp:docPr id="6" name="Рисунок 6"/>
+            <wp:cNvGraphicFramePr>
+              <a:graphicFrameLocks xmlns:a="http://schemas.openxmlformats.org/drawingml/2006/main" noChangeAspect="1"/>
+            </wp:cNvGraphicFramePr>
+            <a:graphic xmlns:a="http://schemas.openxmlformats.org/drawingml/2006/main">
+              <a:graphicData uri="http://schemas.openxmlformats.org/drawingml/2006/picture">
+                <pic:pic xmlns:pic="http://schemas.openxmlformats.org/drawingml/2006/picture">
+                  <pic:nvPicPr>
+                    <pic:cNvPr id="0" name="Picture 7"/>
+                    <pic:cNvPicPr>
+                      <a:picLocks noChangeAspect="1" noChangeArrowheads="1"/>
+                    </pic:cNvPicPr>
+                  </pic:nvPicPr>
+                  <pic:blipFill>
+                    <a:blip r:embed="rId11">
+                      <a:extLst>
+                        <a:ext uri="{28A0092B-C50C-407E-A947-70E740481C1C}">
+                          <a14:useLocalDpi xmlns:a14="http://schemas.microsoft.com/office/drawing/2010/main" val="0"/>
+                        </a:ext>
+                      </a:extLst>
+                    </a:blip>
+                    <a:srcRect/>
+                    <a:stretch>
+                      <a:fillRect/>
+                    </a:stretch>
+                  </pic:blipFill>
+                  <pic:spPr bwMode="auto">
+                    <a:xfrm>
+                      <a:off x="0" y="0"/>
+                      <a:ext cx="3953029" cy="3800348"/>
+                    </a:xfrm>
+                    <a:prstGeom prst="rect">
+                      <a:avLst/>
+                    </a:prstGeom>
+                    <a:noFill/>
+                    <a:ln>
+                      <a:noFill/>
+                    </a:ln>
+                  </pic:spPr>
+                </pic:pic>
+              </a:graphicData>
+            </a:graphic>
+          </wp:inline>
+        </w:drawing>
+      </w:r>
+    </w:p>
+    <w:p>
+      <w:pPr>
+        <w:pStyle w:val="ac"/>
+        <w:spacing w:before="183" w:line="309" w:lineRule="auto"/>
+        <w:ind w:right="163"/>
+        <w:jc w:val="center"/>
+      </w:pPr>
+      <w:r>
+        <w:t xml:space="preserve">Рисунок 7. Пример </w:t>
+      </w:r>
+      <w:proofErr w:type="spellStart"/>
+      <w:r>
+        <w:rPr>
+          <w:lang w:val="en-US"/>
+        </w:rPr>
+        <w:t>MergeSort</w:t>
+      </w:r>
+      <w:proofErr w:type="spellEnd"/>
+    </w:p>
+    <w:p>
+      <w:pPr>
+        <w:pStyle w:val="ac"/>
+        <w:spacing w:before="183" w:line="309" w:lineRule="auto"/>
+        <w:ind w:right="163"/>
+      </w:pPr>
+    </w:p>
+    <w:p>
+      <w:pPr>
+        <w:pStyle w:val="ac"/>
+        <w:spacing w:before="183" w:line="309" w:lineRule="auto"/>
+        <w:ind w:right="163"/>
+      </w:pPr>
+    </w:p>
+    <w:p>
+      <w:pPr>
+        <w:pStyle w:val="ac"/>
+        <w:spacing w:before="183" w:line="309" w:lineRule="auto"/>
+        <w:ind w:right="163"/>
+      </w:pPr>
+      <w:r>
+        <w:lastRenderedPageBreak/>
+        <w:t xml:space="preserve">Описание алгоритма: </w:t>
+      </w:r>
+    </w:p>
+    <w:p>
+      <w:pPr>
+        <w:pStyle w:val="ac"/>
+        <w:numPr>
+          <w:ilvl w:val="0"/>
+          <w:numId w:val="15"/>
+        </w:numPr>
+        <w:spacing w:before="183" w:line="309" w:lineRule="auto"/>
+        <w:ind w:right="163"/>
+      </w:pPr>
+      <w:r>
+        <w:t xml:space="preserve">Получение параметров </w:t>
+      </w:r>
+    </w:p>
+    <w:p>
+      <w:pPr>
+        <w:pStyle w:val="ac"/>
+        <w:numPr>
+          <w:ilvl w:val="0"/>
+          <w:numId w:val="15"/>
+        </w:numPr>
+        <w:spacing w:before="183" w:line="309" w:lineRule="auto"/>
+        <w:ind w:right="163"/>
+      </w:pPr>
+      <w:r>
+        <w:t xml:space="preserve">Создание очереди задач, создание </w:t>
+      </w:r>
+      <w:r>
+        <w:rPr>
+          <w:lang w:val="en-US"/>
+        </w:rPr>
+        <w:t>mutex</w:t>
+      </w:r>
+      <w:r>
+        <w:t xml:space="preserve"> и </w:t>
+      </w:r>
+      <w:proofErr w:type="spellStart"/>
+      <w:r>
+        <w:rPr>
+          <w:lang w:val="en-US"/>
+        </w:rPr>
+        <w:t>cond</w:t>
+      </w:r>
+      <w:proofErr w:type="spellEnd"/>
+      <w:r>
+        <w:t xml:space="preserve">. </w:t>
+      </w:r>
+    </w:p>
+    <w:p>
+      <w:pPr>
+        <w:pStyle w:val="ac"/>
+        <w:numPr>
+          <w:ilvl w:val="0"/>
+          <w:numId w:val="15"/>
+        </w:numPr>
+        <w:spacing w:before="183" w:line="309" w:lineRule="auto"/>
+        <w:ind w:right="163"/>
+      </w:pPr>
+      <w:r>
+        <w:t xml:space="preserve">Создаются потоки, в отличие от быстрой сортировки на момент создания потоков очередь задач пуста. </w:t>
+      </w:r>
+    </w:p>
+    <w:p>
+      <w:pPr>
+        <w:pStyle w:val="ac"/>
+        <w:numPr>
+          <w:ilvl w:val="0"/>
+          <w:numId w:val="15"/>
+        </w:numPr>
+        <w:spacing w:before="183" w:line="309" w:lineRule="auto"/>
+        <w:ind w:right="163"/>
+      </w:pPr>
+      <w:r>
+        <w:t>Начало замера времени</w:t>
+      </w:r>
+    </w:p>
+    <w:p>
+      <w:pPr>
+        <w:pStyle w:val="ac"/>
+        <w:numPr>
+          <w:ilvl w:val="0"/>
+          <w:numId w:val="15"/>
+        </w:numPr>
+        <w:spacing w:before="183" w:line="309" w:lineRule="auto"/>
+        <w:ind w:right="163"/>
+      </w:pPr>
+      <w:r>
+        <w:t xml:space="preserve">Под управлением главного потока берутся пары чисел, выполняется сортировка среди них. Берутся четверки чисел, выполняется сортировка, далее пока массив не будет отсортирован. </w:t>
+      </w:r>
+    </w:p>
+    <w:p>
+      <w:pPr>
+        <w:pStyle w:val="ac"/>
+        <w:numPr>
+          <w:ilvl w:val="0"/>
+          <w:numId w:val="15"/>
+        </w:numPr>
+        <w:spacing w:before="183" w:line="309" w:lineRule="auto"/>
+        <w:ind w:right="163"/>
+      </w:pPr>
+      <w:r>
+        <w:t>Остановка, если размер группы достиг размера массива</w:t>
+      </w:r>
+    </w:p>
+    <w:p>
+      <w:pPr>
+        <w:pStyle w:val="ac"/>
+        <w:numPr>
+          <w:ilvl w:val="0"/>
+          <w:numId w:val="15"/>
+        </w:numPr>
+        <w:spacing w:before="183" w:line="309" w:lineRule="auto"/>
+        <w:ind w:right="163"/>
+      </w:pPr>
+      <w:r>
+        <w:t>Окончание замера времени, запись в файл, освобождение ресурсов</w:t>
+      </w:r>
+    </w:p>
+    <w:p>
+      <w:pPr>
+        <w:pStyle w:val="ac"/>
+        <w:spacing w:before="183" w:line="309" w:lineRule="auto"/>
+        <w:ind w:right="163"/>
+        <w:rPr>
+          <w:noProof/>
+        </w:rPr>
+      </w:pPr>
+    </w:p>
+    <w:p>
+      <w:pPr>
+        <w:pStyle w:val="ac"/>
+        <w:spacing w:before="183" w:line="309" w:lineRule="auto"/>
+        <w:ind w:right="163"/>
+        <w:jc w:val="center"/>
+      </w:pPr>
+      <w:r>
+        <w:rPr>
+          <w:noProof/>
+        </w:rPr>
+        <w:lastRenderedPageBreak/>
+        <w:drawing>
+          <wp:inline distT="0" distB="0" distL="0" distR="0" wp14:anchorId="7553518B" wp14:editId="13AF0CCB">
+            <wp:extent cx="5029200" cy="8676602"/>
+            <wp:effectExtent l="0" t="0" r="0" b="0"/>
+            <wp:docPr id="10" name="Рисунок 10"/>
+            <wp:cNvGraphicFramePr>
+              <a:graphicFrameLocks xmlns:a="http://schemas.openxmlformats.org/drawingml/2006/main" noChangeAspect="1"/>
+            </wp:cNvGraphicFramePr>
+            <a:graphic xmlns:a="http://schemas.openxmlformats.org/drawingml/2006/main">
+              <a:graphicData uri="http://schemas.openxmlformats.org/drawingml/2006/picture">
+                <pic:pic xmlns:pic="http://schemas.openxmlformats.org/drawingml/2006/picture">
+                  <pic:nvPicPr>
+                    <pic:cNvPr id="0" name="Picture 16"/>
+                    <pic:cNvPicPr>
+                      <a:picLocks noChangeAspect="1" noChangeArrowheads="1"/>
+                    </pic:cNvPicPr>
+                  </pic:nvPicPr>
+                  <pic:blipFill rotWithShape="1">
+                    <a:blip r:embed="rId12" cstate="print">
+                      <a:extLst>
+                        <a:ext uri="{28A0092B-C50C-407E-A947-70E740481C1C}">
+                          <a14:useLocalDpi xmlns:a14="http://schemas.microsoft.com/office/drawing/2010/main" val="0"/>
+                        </a:ext>
+                      </a:extLst>
+                    </a:blip>
+                    <a:srcRect t="1544"/>
+                    <a:stretch/>
+                  </pic:blipFill>
+                  <pic:spPr bwMode="auto">
+                    <a:xfrm>
+                      <a:off x="0" y="0"/>
+                      <a:ext cx="5057352" cy="8725170"/>
+                    </a:xfrm>
+                    <a:prstGeom prst="rect">
+                      <a:avLst/>
+                    </a:prstGeom>
+                    <a:noFill/>
+                    <a:ln>
+                      <a:noFill/>
+                    </a:ln>
+                    <a:extLst>
+                      <a:ext uri="{53640926-AAD7-44D8-BBD7-CCE9431645EC}">
+                        <a14:shadowObscured xmlns:a14="http://schemas.microsoft.com/office/drawing/2010/main"/>
+                      </a:ext>
+                    </a:extLst>
+                  </pic:spPr>
+                </pic:pic>
+              </a:graphicData>
+            </a:graphic>
+          </wp:inline>
+        </w:drawing>
+      </w:r>
+    </w:p>
+    <w:p>
+      <w:pPr>
+        <w:pStyle w:val="ac"/>
+        <w:spacing w:before="183" w:line="309" w:lineRule="auto"/>
+        <w:ind w:right="163"/>
+        <w:jc w:val="center"/>
+      </w:pPr>
+      <w:r>
+        <w:t>Рисунок 8. Блок-схема алгоритма</w:t>
+      </w:r>
+    </w:p>
+    <w:p>
+      <w:pPr>
+        <w:pStyle w:val="ac"/>
+        <w:spacing w:before="183" w:line="309" w:lineRule="auto"/>
+        <w:ind w:right="163"/>
+        <w:jc w:val="center"/>
+      </w:pPr>
+      <w:r>
+        <w:rPr>
+          <w:noProof/>
+        </w:rPr>
+        <w:lastRenderedPageBreak/>
+        <w:drawing>
+          <wp:inline distT="0" distB="0" distL="0" distR="0" wp14:anchorId="3BE367E4" wp14:editId="6C671D0B">
+            <wp:extent cx="6314146" cy="3009900"/>
+            <wp:effectExtent l="0" t="0" r="0" b="0"/>
+            <wp:docPr id="11" name="Рисунок 11"/>
+            <wp:cNvGraphicFramePr>
+              <a:graphicFrameLocks xmlns:a="http://schemas.openxmlformats.org/drawingml/2006/main" noChangeAspect="1"/>
+            </wp:cNvGraphicFramePr>
+            <a:graphic xmlns:a="http://schemas.openxmlformats.org/drawingml/2006/main">
+              <a:graphicData uri="http://schemas.openxmlformats.org/drawingml/2006/picture">
+                <pic:pic xmlns:pic="http://schemas.openxmlformats.org/drawingml/2006/picture">
+                  <pic:nvPicPr>
+                    <pic:cNvPr id="0" name="Picture 17"/>
+                    <pic:cNvPicPr>
+                      <a:picLocks noChangeAspect="1" noChangeArrowheads="1"/>
+                    </pic:cNvPicPr>
+                  </pic:nvPicPr>
+                  <pic:blipFill rotWithShape="1">
+                    <a:blip r:embed="rId13" cstate="print">
+                      <a:extLst>
+                        <a:ext uri="{28A0092B-C50C-407E-A947-70E740481C1C}">
+                          <a14:useLocalDpi xmlns:a14="http://schemas.microsoft.com/office/drawing/2010/main" val="0"/>
+                        </a:ext>
+                      </a:extLst>
+                    </a:blip>
+                    <a:srcRect b="8776"/>
+                    <a:stretch/>
+                  </pic:blipFill>
+                  <pic:spPr bwMode="auto">
+                    <a:xfrm>
+                      <a:off x="0" y="0"/>
+                      <a:ext cx="6341254" cy="3022822"/>
+                    </a:xfrm>
+                    <a:prstGeom prst="rect">
+                      <a:avLst/>
+                    </a:prstGeom>
+                    <a:noFill/>
+                    <a:ln>
+                      <a:noFill/>
+                    </a:ln>
+                    <a:extLst>
+                      <a:ext uri="{53640926-AAD7-44D8-BBD7-CCE9431645EC}">
+                        <a14:shadowObscured xmlns:a14="http://schemas.microsoft.com/office/drawing/2010/main"/>
+                      </a:ext>
+                    </a:extLst>
+                  </pic:spPr>
+                </pic:pic>
+              </a:graphicData>
+            </a:graphic>
+          </wp:inline>
+        </w:drawing>
+      </w:r>
+    </w:p>
+    <w:p>
+      <w:pPr>
+        <w:pStyle w:val="ac"/>
+        <w:spacing w:before="183" w:line="309" w:lineRule="auto"/>
+        <w:ind w:right="163"/>
+        <w:jc w:val="center"/>
+      </w:pPr>
+      <w:r>
+        <w:t xml:space="preserve">Рисунок 9. Временная схема потоков </w:t>
+      </w:r>
+    </w:p>
+    <w:p>
+      <w:pPr>
+        <w:pStyle w:val="ac"/>
+        <w:spacing w:before="183" w:line="309" w:lineRule="auto"/>
+        <w:ind w:right="163"/>
+        <w:jc w:val="center"/>
+      </w:pPr>
+    </w:p>
+    <w:p>
+      <w:pPr>
+        <w:pStyle w:val="ac"/>
+        <w:spacing w:before="183" w:line="309" w:lineRule="auto"/>
+        <w:ind w:right="163"/>
+        <w:jc w:val="center"/>
+      </w:pPr>
+    </w:p>
+    <w:p>
+      <w:pPr>
+        <w:pStyle w:val="ac"/>
+        <w:spacing w:before="183" w:line="309" w:lineRule="auto"/>
+        <w:ind w:right="163"/>
+        <w:jc w:val="center"/>
+      </w:pPr>
+    </w:p>
+    <w:p>
+      <w:pPr>
+        <w:pStyle w:val="ac"/>
+        <w:spacing w:before="183" w:line="309" w:lineRule="auto"/>
+        <w:ind w:right="163"/>
+        <w:jc w:val="center"/>
+      </w:pPr>
+    </w:p>
+    <w:p>
+      <w:pPr>
+        <w:pStyle w:val="ac"/>
+        <w:spacing w:before="183" w:line="309" w:lineRule="auto"/>
+        <w:ind w:right="163"/>
+        <w:jc w:val="center"/>
+      </w:pPr>
+    </w:p>
+    <w:p>
+      <w:pPr>
+        <w:pStyle w:val="ac"/>
+        <w:spacing w:before="183" w:line="309" w:lineRule="auto"/>
+        <w:ind w:right="163"/>
+        <w:jc w:val="center"/>
+      </w:pPr>
+    </w:p>
+    <w:p>
+      <w:pPr>
+        <w:pStyle w:val="ac"/>
+        <w:spacing w:before="183" w:line="309" w:lineRule="auto"/>
+        <w:ind w:right="163"/>
+        <w:jc w:val="center"/>
+      </w:pPr>
+    </w:p>
+    <w:p>
+      <w:pPr>
+        <w:pStyle w:val="ac"/>
+        <w:spacing w:before="183" w:line="309" w:lineRule="auto"/>
+        <w:ind w:right="163"/>
+        <w:jc w:val="center"/>
+      </w:pPr>
+    </w:p>
+    <w:p>
+      <w:pPr>
+        <w:pStyle w:val="ac"/>
+        <w:spacing w:before="183" w:line="309" w:lineRule="auto"/>
+        <w:ind w:right="163"/>
+        <w:jc w:val="center"/>
+      </w:pPr>
+    </w:p>
+    <w:p>
+      <w:pPr>
+        <w:pStyle w:val="ac"/>
+        <w:spacing w:before="183" w:line="309" w:lineRule="auto"/>
+        <w:ind w:right="163"/>
+        <w:jc w:val="center"/>
+      </w:pPr>
+    </w:p>
+    <w:p>
+      <w:pPr>
+        <w:pStyle w:val="ac"/>
+        <w:spacing w:before="183" w:line="309" w:lineRule="auto"/>
+        <w:ind w:right="163"/>
+        <w:jc w:val="center"/>
+      </w:pPr>
+    </w:p>
+    <w:p>
+      <w:pPr>
+        <w:pStyle w:val="ac"/>
+        <w:spacing w:before="183" w:line="309" w:lineRule="auto"/>
+        <w:ind w:right="163"/>
+        <w:jc w:val="center"/>
+      </w:pPr>
+    </w:p>
+    <w:p>
+      <w:pPr>
+        <w:pStyle w:val="ac"/>
+        <w:spacing w:before="183" w:line="309" w:lineRule="auto"/>
+        <w:ind w:right="163"/>
+        <w:jc w:val="center"/>
+      </w:pPr>
+    </w:p>
+    <w:p>
+      <w:pPr>
+        <w:pStyle w:val="ac"/>
+        <w:spacing w:before="183" w:line="309" w:lineRule="auto"/>
+        <w:ind w:right="163"/>
+        <w:jc w:val="center"/>
+      </w:pPr>
+    </w:p>
+    <w:p>
+      <w:pPr>
+        <w:pStyle w:val="ac"/>
+        <w:spacing w:before="183" w:line="309" w:lineRule="auto"/>
+        <w:ind w:right="163"/>
+        <w:jc w:val="center"/>
+      </w:pPr>
+    </w:p>
+    <w:p>
+      <w:pPr>
+        <w:pStyle w:val="ac"/>
+        <w:numPr>
+          <w:ilvl w:val="1"/>
+          <w:numId w:val="2"/>
+        </w:numPr>
+        <w:spacing w:before="183" w:line="309" w:lineRule="auto"/>
+        <w:ind w:right="163"/>
+      </w:pPr>
+      <w:r>
+        <w:lastRenderedPageBreak/>
+        <w:t xml:space="preserve">Задача о философах </w:t>
+      </w:r>
+    </w:p>
+    <w:p>
+      <w:pPr>
+        <w:pStyle w:val="ac"/>
+        <w:spacing w:before="183" w:line="309" w:lineRule="auto"/>
+        <w:ind w:right="163"/>
+      </w:pPr>
+      <w:r>
+        <w:t>Пять философов сидят возле круглого стола. Они проводят жизнь, чередуя приемы пищи и размышления. Запас пищи в тарелке философа бесконечен. Для поедания пищи философу требуется две вилки: одну он берет в правую руку, другую — в левую. Философам дали только пять вилок на всех. Между каждой парой философов лежит одна вилка. Поэтому они договорились, что каждый из них пользуется только теми вилками, которые лежат рядом с ним (слева и справа).</w:t>
+      </w:r>
+      <w:r>
+        <w:t xml:space="preserve"> </w:t>
+      </w:r>
+      <w:r>
+        <w:t>Когда философ хочет есть, он сообщает управляющему и ждет разрешения, т.е. ждет, что ему дадут обе вилки.</w:t>
+      </w:r>
+      <w:r>
+        <w:t xml:space="preserve"> </w:t>
+      </w:r>
+      <w:r>
+        <w:t>Изначально все философы находятся в состоянии "T" (</w:t>
+      </w:r>
+      <w:proofErr w:type="spellStart"/>
+      <w:r>
+        <w:t>Thinking</w:t>
+      </w:r>
+      <w:proofErr w:type="spellEnd"/>
+      <w:r>
+        <w:t xml:space="preserve">, "размышляет"). </w:t>
+      </w:r>
+    </w:p>
+    <w:p>
+      <w:pPr>
+        <w:pStyle w:val="ac"/>
+        <w:spacing w:before="183" w:line="309" w:lineRule="auto"/>
+        <w:ind w:right="163"/>
+      </w:pPr>
+      <w:r>
+        <w:t xml:space="preserve">Описание алгоритма: </w:t>
+      </w:r>
+    </w:p>
+    <w:p>
+      <w:pPr>
+        <w:pStyle w:val="ac"/>
+        <w:numPr>
+          <w:ilvl w:val="0"/>
+          <w:numId w:val="16"/>
+        </w:numPr>
+        <w:spacing w:before="183" w:line="309" w:lineRule="auto"/>
+        <w:ind w:right="163"/>
+      </w:pPr>
+      <w:r>
+        <w:t>Получение параметров</w:t>
+      </w:r>
+    </w:p>
+    <w:p>
+      <w:pPr>
+        <w:pStyle w:val="ac"/>
+        <w:numPr>
+          <w:ilvl w:val="0"/>
+          <w:numId w:val="16"/>
+        </w:numPr>
+        <w:spacing w:before="183" w:line="309" w:lineRule="auto"/>
+        <w:ind w:right="163"/>
+      </w:pPr>
+      <w:r>
+        <w:t>Обнуление данных структуры философов</w:t>
+      </w:r>
+    </w:p>
+    <w:p>
+      <w:pPr>
+        <w:pStyle w:val="ac"/>
+        <w:numPr>
+          <w:ilvl w:val="0"/>
+          <w:numId w:val="16"/>
+        </w:numPr>
+        <w:spacing w:before="183" w:line="309" w:lineRule="auto"/>
+        <w:ind w:right="163"/>
+      </w:pPr>
+      <w:r>
+        <w:t>Отсчет времени, выделение памяти под потоки, создание потоков (5 потоков под философов, 1 поток под управление)</w:t>
+      </w:r>
+    </w:p>
+    <w:p>
+      <w:pPr>
+        <w:pStyle w:val="ac"/>
+        <w:numPr>
+          <w:ilvl w:val="0"/>
+          <w:numId w:val="16"/>
+        </w:numPr>
+        <w:spacing w:before="183" w:line="309" w:lineRule="auto"/>
+        <w:ind w:right="163"/>
+      </w:pPr>
+      <w:r>
+        <w:t xml:space="preserve">Инициализация семафоров, 5 персональных семафоров, начинающихся с нуля (состояния заблокировано), один семафор для управляющего (работает как </w:t>
+      </w:r>
+      <w:r>
+        <w:rPr>
+          <w:lang w:val="en-US"/>
+        </w:rPr>
+        <w:t>mutex</w:t>
+      </w:r>
+      <w:r>
+        <w:t xml:space="preserve"> </w:t>
+      </w:r>
+      <w:r>
+        <w:t>на общие данные), контролирующий семафор, семафор для печати</w:t>
+      </w:r>
+    </w:p>
+    <w:p>
+      <w:pPr>
+        <w:pStyle w:val="ac"/>
+        <w:numPr>
+          <w:ilvl w:val="0"/>
+          <w:numId w:val="16"/>
+        </w:numPr>
+        <w:spacing w:before="183" w:line="309" w:lineRule="auto"/>
+        <w:ind w:right="163"/>
+      </w:pPr>
+      <w:r>
+        <w:t>Запуск потоков</w:t>
+      </w:r>
+    </w:p>
+    <w:p>
+      <w:pPr>
+        <w:pStyle w:val="ac"/>
+        <w:numPr>
+          <w:ilvl w:val="0"/>
+          <w:numId w:val="16"/>
+        </w:numPr>
+        <w:spacing w:before="183" w:line="309" w:lineRule="auto"/>
+        <w:ind w:right="163"/>
+      </w:pPr>
+      <w:r>
+        <w:t xml:space="preserve">Философ засыпает, если время сна еще активно. </w:t>
+      </w:r>
+    </w:p>
+    <w:p>
+      <w:pPr>
+        <w:pStyle w:val="ac"/>
+        <w:numPr>
+          <w:ilvl w:val="0"/>
+          <w:numId w:val="16"/>
+        </w:numPr>
+        <w:spacing w:before="183" w:line="309" w:lineRule="auto"/>
+        <w:ind w:right="163"/>
+      </w:pPr>
+      <w:r>
+        <w:t xml:space="preserve">Философ переключается в режим </w:t>
+      </w:r>
+      <w:r>
+        <w:rPr>
+          <w:lang w:val="en-US"/>
+        </w:rPr>
+        <w:t>EAT</w:t>
+      </w:r>
+      <w:r>
+        <w:t xml:space="preserve">, будит управляющий поток и ожидает разрешения. </w:t>
+      </w:r>
+    </w:p>
+    <w:p>
+      <w:pPr>
+        <w:pStyle w:val="ac"/>
+        <w:numPr>
+          <w:ilvl w:val="0"/>
+          <w:numId w:val="16"/>
+        </w:numPr>
+        <w:spacing w:before="183" w:line="309" w:lineRule="auto"/>
+        <w:ind w:right="163"/>
+      </w:pPr>
+      <w:r>
+        <w:t xml:space="preserve">Управляющий поток спит, пока кто-то не попросит есть. Ищет поток, у которого стоит состояние </w:t>
+      </w:r>
+      <w:r>
+        <w:rPr>
+          <w:lang w:val="en-US"/>
+        </w:rPr>
+        <w:t>EAT</w:t>
+      </w:r>
+    </w:p>
+    <w:p>
+      <w:pPr>
+        <w:pStyle w:val="ac"/>
+        <w:numPr>
+          <w:ilvl w:val="0"/>
+          <w:numId w:val="16"/>
+        </w:numPr>
+        <w:spacing w:before="183" w:line="309" w:lineRule="auto"/>
+        <w:ind w:right="163"/>
+      </w:pPr>
+      <w:r>
+        <w:t xml:space="preserve">Управляющий поток выдает вилки тому, кто дольше всех ждет. Список сортируется по </w:t>
+      </w:r>
+      <w:r>
+        <w:rPr>
+          <w:lang w:val="en-US"/>
+        </w:rPr>
+        <w:t>wait</w:t>
+      </w:r>
+      <w:r>
+        <w:t>_</w:t>
+      </w:r>
+      <w:r>
+        <w:rPr>
+          <w:lang w:val="en-US"/>
+        </w:rPr>
+        <w:t>since</w:t>
+      </w:r>
+      <w:r>
+        <w:t xml:space="preserve">. </w:t>
+      </w:r>
+    </w:p>
+    <w:p>
+      <w:pPr>
+        <w:pStyle w:val="ac"/>
+        <w:numPr>
+          <w:ilvl w:val="0"/>
+          <w:numId w:val="16"/>
+        </w:numPr>
+        <w:spacing w:before="183" w:line="309" w:lineRule="auto"/>
+        <w:ind w:right="163"/>
+      </w:pPr>
+      <w:r>
+        <w:t xml:space="preserve">Если обе соседние вилки свободны, то выдает их и помечает философа, и будит его персональный семафор. Иначе, оставляет </w:t>
+      </w:r>
+      <w:r>
+        <w:lastRenderedPageBreak/>
+        <w:t xml:space="preserve">ждать. </w:t>
+      </w:r>
+    </w:p>
+    <w:p>
+      <w:pPr>
+        <w:pStyle w:val="ac"/>
+        <w:numPr>
+          <w:ilvl w:val="0"/>
+          <w:numId w:val="16"/>
+        </w:numPr>
+        <w:spacing w:before="183" w:line="309" w:lineRule="auto"/>
+        <w:ind w:right="163"/>
+      </w:pPr>
+      <w:r>
+        <w:t xml:space="preserve">Философ, взявший вилки начинает есть. То есть засыпает на определенное количество мс. </w:t>
+      </w:r>
+    </w:p>
+    <w:p>
+      <w:pPr>
+        <w:pStyle w:val="ac"/>
+        <w:numPr>
+          <w:ilvl w:val="0"/>
+          <w:numId w:val="16"/>
+        </w:numPr>
+        <w:spacing w:before="183" w:line="309" w:lineRule="auto"/>
+        <w:ind w:right="163"/>
+      </w:pPr>
+      <w:r>
+        <w:t xml:space="preserve">Философ освобождает вилки, меняет свое состояние из </w:t>
+      </w:r>
+      <w:r>
+        <w:rPr>
+          <w:lang w:val="en-US"/>
+        </w:rPr>
+        <w:t>EAT</w:t>
+      </w:r>
+      <w:r>
+        <w:t xml:space="preserve"> </w:t>
+      </w:r>
+      <w:r>
+        <w:t xml:space="preserve">в </w:t>
+      </w:r>
+      <w:r>
+        <w:rPr>
+          <w:lang w:val="en-US"/>
+        </w:rPr>
+        <w:t>THINKING</w:t>
+      </w:r>
+      <w:r>
+        <w:t xml:space="preserve"> </w:t>
+      </w:r>
+      <w:r>
+        <w:t>и будит управляющий поток</w:t>
+      </w:r>
+    </w:p>
+    <w:p>
+      <w:pPr>
+        <w:pStyle w:val="ac"/>
+        <w:numPr>
+          <w:ilvl w:val="0"/>
+          <w:numId w:val="16"/>
+        </w:numPr>
+        <w:spacing w:before="183" w:line="309" w:lineRule="auto"/>
+        <w:ind w:right="163"/>
+      </w:pPr>
+      <w:r>
+        <w:t>Когда управляющий поток видит, что время вышло будит всех философов, независимо от их состояния</w:t>
+      </w:r>
+    </w:p>
+    <w:p>
+      <w:pPr>
+        <w:pStyle w:val="ac"/>
+        <w:numPr>
+          <w:ilvl w:val="0"/>
+          <w:numId w:val="16"/>
+        </w:numPr>
+        <w:spacing w:before="183" w:line="309" w:lineRule="auto"/>
+        <w:ind w:right="163"/>
+      </w:pPr>
+      <w:r>
+        <w:t>Сначала освобождается управляющий поток, затем все остальные, затем семафоры, массивы дескрипторов</w:t>
+      </w:r>
+    </w:p>
+    <w:p>
+      <w:pPr>
+        <w:pStyle w:val="ac"/>
+        <w:spacing w:before="183" w:line="309" w:lineRule="auto"/>
+        <w:ind w:left="873" w:right="163"/>
       </w:pPr>
     </w:p>
     <w:sectPr>
@@ -2536,6 +3814,95 @@
 <file path=word/numbering.xml><?xml version="1.0" encoding="utf-8"?>
 <w:numbering xmlns:wpc="http://schemas.microsoft.com/office/word/2010/wordprocessingCanvas" xmlns:cx="http://schemas.microsoft.com/office/drawing/2014/chartex" xmlns:cx1="http://schemas.microsoft.com/office/drawing/2015/9/8/chartex" xmlns:cx2="http://schemas.microsoft.com/office/drawing/2015/10/21/chartex" xmlns:cx3="http://schemas.microsoft.com/office/drawing/2016/5/9/chartex" xmlns:cx4="http://schemas.microsoft.com/office/drawing/2016/5/10/chartex" xmlns:cx5="http://schemas.microsoft.com/office/drawing/2016/5/11/chartex" xmlns:cx6="http://schemas.microsoft.com/office/drawing/2016/5/12/chartex" xmlns:cx7="http://schemas.microsoft.com/office/drawing/2016/5/13/chartex" xmlns:cx8="http://schemas.microsoft.com/office/drawing/2016/5/14/chartex" xmlns:mc="http://schemas.openxmlformats.org/markup-compatibility/2006" xmlns:aink="http://schemas.microsoft.com/office/drawing/2016/ink" xmlns:am3d="http://schemas.microsoft.com/office/drawing/2017/model3d" xmlns:o="urn:schemas-microsoft-com:office:office" xmlns:oel="http://schemas.microsoft.com/office/2019/extlst" xmlns:r="http://schemas.openxmlformats.org/officeDocument/2006/relationships" xmlns:m="http://schemas.openxmlformats.org/officeDocument/2006/math" xmlns:v="urn:schemas-microsoft-com:vml" xmlns:wp14="http://schemas.microsoft.com/office/word/2010/wordprocessingDrawing" xmlns:wp="http://schemas.openxmlformats.org/drawingml/2006/wordprocessingDrawing" xmlns:w10="urn:schemas-microsoft-com:office:word" xmlns:w="http://schemas.openxmlformats.org/wordprocessingml/2006/main" xmlns:w14="http://schemas.microsoft.com/office/word/2010/wordml" xmlns:w15="http://schemas.microsoft.com/office/word/2012/wordml" xmlns:w16cex="http://schemas.microsoft.com/office/word/2018/wordml/cex" xmlns:w16cid="http://schemas.microsoft.com/office/word/2016/wordml/cid" xmlns:w16="http://schemas.microsoft.com/office/word/2018/wordml" xmlns:w16sdtdh="http://schemas.microsoft.com/office/word/2020/wordml/sdtdatahash" xmlns:w16se="http://schemas.microsoft.com/office/word/2015/wordml/symex" xmlns:wpg="http://schemas.microsoft.com/office/word/2010/wordprocessingGroup" xmlns:wpi="http://schemas.microsoft.com/office/word/2010/wordprocessingInk" xmlns:wne="http://schemas.microsoft.com/office/word/2006/wordml" xmlns:wps="http://schemas.microsoft.com/office/word/2010/wordprocessingShape" mc:Ignorable="w14 w15 w16se w16cid w16 w16cex w16sdtdh wp14">
   <w:abstractNum w:abstractNumId="0" w15:restartNumberingAfterBreak="0">
+    <w:nsid w:val="10E25E35"/>
+    <w:multiLevelType w:val="hybridMultilevel"/>
+    <w:tmpl w:val="4CA26F02"/>
+    <w:lvl w:ilvl="0" w:tplc="0419000F">
+      <w:start w:val="1"/>
+      <w:numFmt w:val="decimal"/>
+      <w:lvlText w:val="%1."/>
+      <w:lvlJc w:val="left"/>
+      <w:pPr>
+        <w:ind w:left="720" w:hanging="360"/>
+      </w:pPr>
+      <w:rPr>
+        <w:rFonts w:hint="default"/>
+      </w:rPr>
+    </w:lvl>
+    <w:lvl w:ilvl="1" w:tplc="04190019" w:tentative="1">
+      <w:start w:val="1"/>
+      <w:numFmt w:val="lowerLetter"/>
+      <w:lvlText w:val="%2."/>
+      <w:lvlJc w:val="left"/>
+      <w:pPr>
+        <w:ind w:left="1440" w:hanging="360"/>
+      </w:pPr>
+    </w:lvl>
+    <w:lvl w:ilvl="2" w:tplc="0419001B" w:tentative="1">
+      <w:start w:val="1"/>
+      <w:numFmt w:val="lowerRoman"/>
+      <w:lvlText w:val="%3."/>
+      <w:lvlJc w:val="right"/>
+      <w:pPr>
+        <w:ind w:left="2160" w:hanging="180"/>
+      </w:pPr>
+    </w:lvl>
+    <w:lvl w:ilvl="3" w:tplc="0419000F" w:tentative="1">
+      <w:start w:val="1"/>
+      <w:numFmt w:val="decimal"/>
+      <w:lvlText w:val="%4."/>
+      <w:lvlJc w:val="left"/>
+      <w:pPr>
+        <w:ind w:left="2880" w:hanging="360"/>
+      </w:pPr>
+    </w:lvl>
+    <w:lvl w:ilvl="4" w:tplc="04190019" w:tentative="1">
+      <w:start w:val="1"/>
+      <w:numFmt w:val="lowerLetter"/>
+      <w:lvlText w:val="%5."/>
+      <w:lvlJc w:val="left"/>
+      <w:pPr>
+        <w:ind w:left="3600" w:hanging="360"/>
+      </w:pPr>
+    </w:lvl>
+    <w:lvl w:ilvl="5" w:tplc="0419001B" w:tentative="1">
+      <w:start w:val="1"/>
+      <w:numFmt w:val="lowerRoman"/>
+      <w:lvlText w:val="%6."/>
+      <w:lvlJc w:val="right"/>
+      <w:pPr>
+        <w:ind w:left="4320" w:hanging="180"/>
+      </w:pPr>
+    </w:lvl>
+    <w:lvl w:ilvl="6" w:tplc="0419000F" w:tentative="1">
+      <w:start w:val="1"/>
+      <w:numFmt w:val="decimal"/>
+      <w:lvlText w:val="%7."/>
+      <w:lvlJc w:val="left"/>
+      <w:pPr>
+        <w:ind w:left="5040" w:hanging="360"/>
+      </w:pPr>
+    </w:lvl>
+    <w:lvl w:ilvl="7" w:tplc="04190019" w:tentative="1">
+      <w:start w:val="1"/>
+      <w:numFmt w:val="lowerLetter"/>
+      <w:lvlText w:val="%8."/>
+      <w:lvlJc w:val="left"/>
+      <w:pPr>
+        <w:ind w:left="5760" w:hanging="360"/>
+      </w:pPr>
+    </w:lvl>
+    <w:lvl w:ilvl="8" w:tplc="0419001B" w:tentative="1">
+      <w:start w:val="1"/>
+      <w:numFmt w:val="lowerRoman"/>
+      <w:lvlText w:val="%9."/>
+      <w:lvlJc w:val="right"/>
+      <w:pPr>
+        <w:ind w:left="6480" w:hanging="180"/>
+      </w:pPr>
+    </w:lvl>
+  </w:abstractNum>
+  <w:abstractNum w:abstractNumId="1" w15:restartNumberingAfterBreak="0">
     <w:nsid w:val="258F1A9D"/>
     <w:multiLevelType w:val="multilevel"/>
     <w:tmpl w:val="39BC5B20"/>
@@ -2648,7 +4015,7 @@
       </w:pPr>
     </w:lvl>
   </w:abstractNum>
-  <w:abstractNum w:abstractNumId="1" w15:restartNumberingAfterBreak="0">
+  <w:abstractNum w:abstractNumId="2" w15:restartNumberingAfterBreak="0">
     <w:nsid w:val="2D6C351F"/>
     <w:multiLevelType w:val="multilevel"/>
     <w:tmpl w:val="6298F0FA"/>
@@ -2761,7 +4128,7 @@
       </w:pPr>
     </w:lvl>
   </w:abstractNum>
-  <w:abstractNum w:abstractNumId="2" w15:restartNumberingAfterBreak="0">
+  <w:abstractNum w:abstractNumId="3" w15:restartNumberingAfterBreak="0">
     <w:nsid w:val="37992C4C"/>
     <w:multiLevelType w:val="multilevel"/>
     <w:tmpl w:val="B2B8B08A"/>
@@ -2892,7 +4259,7 @@
       </w:rPr>
     </w:lvl>
   </w:abstractNum>
-  <w:abstractNum w:abstractNumId="3" w15:restartNumberingAfterBreak="0">
+  <w:abstractNum w:abstractNumId="4" w15:restartNumberingAfterBreak="0">
     <w:nsid w:val="3FA71F67"/>
     <w:multiLevelType w:val="hybridMultilevel"/>
     <w:tmpl w:val="5B822446"/>
@@ -2981,7 +4348,7 @@
       </w:pPr>
     </w:lvl>
   </w:abstractNum>
-  <w:abstractNum w:abstractNumId="4" w15:restartNumberingAfterBreak="0">
+  <w:abstractNum w:abstractNumId="5" w15:restartNumberingAfterBreak="0">
     <w:nsid w:val="478A37B1"/>
     <w:multiLevelType w:val="multilevel"/>
     <w:tmpl w:val="A48048FC"/>
@@ -3102,7 +4469,7 @@
       </w:rPr>
     </w:lvl>
   </w:abstractNum>
-  <w:abstractNum w:abstractNumId="5" w15:restartNumberingAfterBreak="0">
+  <w:abstractNum w:abstractNumId="6" w15:restartNumberingAfterBreak="0">
     <w:nsid w:val="4E060336"/>
     <w:multiLevelType w:val="hybridMultilevel"/>
     <w:tmpl w:val="40DA588C"/>
@@ -3191,7 +4558,7 @@
       </w:pPr>
     </w:lvl>
   </w:abstractNum>
-  <w:abstractNum w:abstractNumId="6" w15:restartNumberingAfterBreak="0">
+  <w:abstractNum w:abstractNumId="7" w15:restartNumberingAfterBreak="0">
     <w:nsid w:val="56693B8C"/>
     <w:multiLevelType w:val="multilevel"/>
     <w:tmpl w:val="6298F0FA"/>
@@ -3304,7 +4671,7 @@
       </w:pPr>
     </w:lvl>
   </w:abstractNum>
-  <w:abstractNum w:abstractNumId="7" w15:restartNumberingAfterBreak="0">
+  <w:abstractNum w:abstractNumId="8" w15:restartNumberingAfterBreak="0">
     <w:nsid w:val="5F0B01A0"/>
     <w:multiLevelType w:val="hybridMultilevel"/>
     <w:tmpl w:val="237816F0"/>
@@ -3426,7 +4793,7 @@
       </w:rPr>
     </w:lvl>
   </w:abstractNum>
-  <w:abstractNum w:abstractNumId="8" w15:restartNumberingAfterBreak="0">
+  <w:abstractNum w:abstractNumId="9" w15:restartNumberingAfterBreak="0">
     <w:nsid w:val="67F2704D"/>
     <w:multiLevelType w:val="multilevel"/>
     <w:tmpl w:val="0AA00D78"/>
@@ -3539,7 +4906,7 @@
       </w:pPr>
     </w:lvl>
   </w:abstractNum>
-  <w:abstractNum w:abstractNumId="9" w15:restartNumberingAfterBreak="0">
+  <w:abstractNum w:abstractNumId="10" w15:restartNumberingAfterBreak="0">
     <w:nsid w:val="693E5040"/>
     <w:multiLevelType w:val="hybridMultilevel"/>
     <w:tmpl w:val="74A2CCC8"/>
@@ -3628,7 +4995,7 @@
       </w:pPr>
     </w:lvl>
   </w:abstractNum>
-  <w:abstractNum w:abstractNumId="10" w15:restartNumberingAfterBreak="0">
+  <w:abstractNum w:abstractNumId="11" w15:restartNumberingAfterBreak="0">
     <w:nsid w:val="74DF503E"/>
     <w:multiLevelType w:val="hybridMultilevel"/>
     <w:tmpl w:val="A3929A88"/>
@@ -3717,7 +5084,138 @@
       </w:pPr>
     </w:lvl>
   </w:abstractNum>
-  <w:abstractNum w:abstractNumId="11" w15:restartNumberingAfterBreak="0">
+  <w:abstractNum w:abstractNumId="12" w15:restartNumberingAfterBreak="0">
+    <w:nsid w:val="75F6363D"/>
+    <w:multiLevelType w:val="multilevel"/>
+    <w:tmpl w:val="98A8DE28"/>
+    <w:lvl w:ilvl="0">
+      <w:start w:val="1"/>
+      <w:numFmt w:val="decimal"/>
+      <w:lvlText w:val="%1."/>
+      <w:lvlJc w:val="left"/>
+      <w:pPr>
+        <w:ind w:left="1209" w:hanging="336"/>
+      </w:pPr>
+      <w:rPr>
+        <w:rFonts w:ascii="Times New Roman" w:eastAsia="Times New Roman" w:hAnsi="Times New Roman" w:cs="Times New Roman" w:hint="default"/>
+        <w:b w:val="0"/>
+        <w:bCs w:val="0"/>
+        <w:i w:val="0"/>
+        <w:iCs w:val="0"/>
+        <w:spacing w:val="0"/>
+        <w:w w:val="100"/>
+        <w:sz w:val="28"/>
+        <w:szCs w:val="28"/>
+        <w:lang w:val="ru-RU" w:eastAsia="en-US" w:bidi="ar-SA"/>
+      </w:rPr>
+    </w:lvl>
+    <w:lvl w:ilvl="1">
+      <w:start w:val="1"/>
+      <w:numFmt w:val="decimal"/>
+      <w:lvlText w:val="%1.%2."/>
+      <w:lvlJc w:val="left"/>
+      <w:pPr>
+        <w:ind w:left="1377" w:hanging="504"/>
+      </w:pPr>
+      <w:rPr>
+        <w:rFonts w:ascii="Times New Roman" w:eastAsia="Times New Roman" w:hAnsi="Times New Roman" w:cs="Times New Roman" w:hint="default"/>
+        <w:b/>
+        <w:bCs/>
+        <w:i w:val="0"/>
+        <w:iCs w:val="0"/>
+        <w:spacing w:val="0"/>
+        <w:w w:val="100"/>
+        <w:sz w:val="28"/>
+        <w:szCs w:val="28"/>
+        <w:lang w:val="ru-RU" w:eastAsia="en-US" w:bidi="ar-SA"/>
+      </w:rPr>
+    </w:lvl>
+    <w:lvl w:ilvl="2">
+      <w:numFmt w:val="bullet"/>
+      <w:lvlText w:val="•"/>
+      <w:lvlJc w:val="left"/>
+      <w:pPr>
+        <w:ind w:left="2250" w:hanging="504"/>
+      </w:pPr>
+      <w:rPr>
+        <w:rFonts w:hint="default"/>
+        <w:lang w:val="ru-RU" w:eastAsia="en-US" w:bidi="ar-SA"/>
+      </w:rPr>
+    </w:lvl>
+    <w:lvl w:ilvl="3">
+      <w:numFmt w:val="bullet"/>
+      <w:lvlText w:val="•"/>
+      <w:lvlJc w:val="left"/>
+      <w:pPr>
+        <w:ind w:left="3120" w:hanging="504"/>
+      </w:pPr>
+      <w:rPr>
+        <w:rFonts w:hint="default"/>
+        <w:lang w:val="ru-RU" w:eastAsia="en-US" w:bidi="ar-SA"/>
+      </w:rPr>
+    </w:lvl>
+    <w:lvl w:ilvl="4">
+      <w:numFmt w:val="bullet"/>
+      <w:lvlText w:val="•"/>
+      <w:lvlJc w:val="left"/>
+      <w:pPr>
+        <w:ind w:left="3991" w:hanging="504"/>
+      </w:pPr>
+      <w:rPr>
+        <w:rFonts w:hint="default"/>
+        <w:lang w:val="ru-RU" w:eastAsia="en-US" w:bidi="ar-SA"/>
+      </w:rPr>
+    </w:lvl>
+    <w:lvl w:ilvl="5">
+      <w:numFmt w:val="bullet"/>
+      <w:lvlText w:val="•"/>
+      <w:lvlJc w:val="left"/>
+      <w:pPr>
+        <w:ind w:left="4861" w:hanging="504"/>
+      </w:pPr>
+      <w:rPr>
+        <w:rFonts w:hint="default"/>
+        <w:lang w:val="ru-RU" w:eastAsia="en-US" w:bidi="ar-SA"/>
+      </w:rPr>
+    </w:lvl>
+    <w:lvl w:ilvl="6">
+      <w:numFmt w:val="bullet"/>
+      <w:lvlText w:val="•"/>
+      <w:lvlJc w:val="left"/>
+      <w:pPr>
+        <w:ind w:left="5731" w:hanging="504"/>
+      </w:pPr>
+      <w:rPr>
+        <w:rFonts w:hint="default"/>
+        <w:lang w:val="ru-RU" w:eastAsia="en-US" w:bidi="ar-SA"/>
+      </w:rPr>
+    </w:lvl>
+    <w:lvl w:ilvl="7">
+      <w:numFmt w:val="bullet"/>
+      <w:lvlText w:val="•"/>
+      <w:lvlJc w:val="left"/>
+      <w:pPr>
+        <w:ind w:left="6602" w:hanging="504"/>
+      </w:pPr>
+      <w:rPr>
+        <w:rFonts w:hint="default"/>
+        <w:lang w:val="ru-RU" w:eastAsia="en-US" w:bidi="ar-SA"/>
+      </w:rPr>
+    </w:lvl>
+    <w:lvl w:ilvl="8">
+      <w:numFmt w:val="bullet"/>
+      <w:lvlText w:val="•"/>
+      <w:lvlJc w:val="left"/>
+      <w:pPr>
+        <w:ind w:left="7472" w:hanging="504"/>
+      </w:pPr>
+      <w:rPr>
+        <w:rFonts w:hint="default"/>
+        <w:lang w:val="ru-RU" w:eastAsia="en-US" w:bidi="ar-SA"/>
+      </w:rPr>
+    </w:lvl>
+  </w:abstractNum>
+  <w:abstractNum w:abstractNumId="13" w15:restartNumberingAfterBreak="0">
     <w:nsid w:val="7CE94D9A"/>
     <w:multiLevelType w:val="hybridMultilevel"/>
     <w:tmpl w:val="130C06B6"/>
@@ -3806,7 +5304,7 @@
       </w:pPr>
     </w:lvl>
   </w:abstractNum>
-  <w:abstractNum w:abstractNumId="12" w15:restartNumberingAfterBreak="0">
+  <w:abstractNum w:abstractNumId="14" w15:restartNumberingAfterBreak="0">
     <w:nsid w:val="7D824A93"/>
     <w:multiLevelType w:val="hybridMultilevel"/>
     <w:tmpl w:val="83082D30"/>
@@ -3895,44 +5393,142 @@
       </w:pPr>
     </w:lvl>
   </w:abstractNum>
+  <w:abstractNum w:abstractNumId="15" w15:restartNumberingAfterBreak="0">
+    <w:nsid w:val="7E4B4BD5"/>
+    <w:multiLevelType w:val="hybridMultilevel"/>
+    <w:tmpl w:val="F2265B52"/>
+    <w:lvl w:ilvl="0" w:tplc="9EC8E850">
+      <w:start w:val="1"/>
+      <w:numFmt w:val="decimal"/>
+      <w:lvlText w:val="%1."/>
+      <w:lvlJc w:val="left"/>
+      <w:pPr>
+        <w:ind w:left="1569" w:hanging="360"/>
+      </w:pPr>
+      <w:rPr>
+        <w:rFonts w:hint="default"/>
+      </w:rPr>
+    </w:lvl>
+    <w:lvl w:ilvl="1" w:tplc="04190019" w:tentative="1">
+      <w:start w:val="1"/>
+      <w:numFmt w:val="lowerLetter"/>
+      <w:lvlText w:val="%2."/>
+      <w:lvlJc w:val="left"/>
+      <w:pPr>
+        <w:ind w:left="2289" w:hanging="360"/>
+      </w:pPr>
+    </w:lvl>
+    <w:lvl w:ilvl="2" w:tplc="0419001B" w:tentative="1">
+      <w:start w:val="1"/>
+      <w:numFmt w:val="lowerRoman"/>
+      <w:lvlText w:val="%3."/>
+      <w:lvlJc w:val="right"/>
+      <w:pPr>
+        <w:ind w:left="3009" w:hanging="180"/>
+      </w:pPr>
+    </w:lvl>
+    <w:lvl w:ilvl="3" w:tplc="0419000F" w:tentative="1">
+      <w:start w:val="1"/>
+      <w:numFmt w:val="decimal"/>
+      <w:lvlText w:val="%4."/>
+      <w:lvlJc w:val="left"/>
+      <w:pPr>
+        <w:ind w:left="3729" w:hanging="360"/>
+      </w:pPr>
+    </w:lvl>
+    <w:lvl w:ilvl="4" w:tplc="04190019" w:tentative="1">
+      <w:start w:val="1"/>
+      <w:numFmt w:val="lowerLetter"/>
+      <w:lvlText w:val="%5."/>
+      <w:lvlJc w:val="left"/>
+      <w:pPr>
+        <w:ind w:left="4449" w:hanging="360"/>
+      </w:pPr>
+    </w:lvl>
+    <w:lvl w:ilvl="5" w:tplc="0419001B" w:tentative="1">
+      <w:start w:val="1"/>
+      <w:numFmt w:val="lowerRoman"/>
+      <w:lvlText w:val="%6."/>
+      <w:lvlJc w:val="right"/>
+      <w:pPr>
+        <w:ind w:left="5169" w:hanging="180"/>
+      </w:pPr>
+    </w:lvl>
+    <w:lvl w:ilvl="6" w:tplc="0419000F" w:tentative="1">
+      <w:start w:val="1"/>
+      <w:numFmt w:val="decimal"/>
+      <w:lvlText w:val="%7."/>
+      <w:lvlJc w:val="left"/>
+      <w:pPr>
+        <w:ind w:left="5889" w:hanging="360"/>
+      </w:pPr>
+    </w:lvl>
+    <w:lvl w:ilvl="7" w:tplc="04190019" w:tentative="1">
+      <w:start w:val="1"/>
+      <w:numFmt w:val="lowerLetter"/>
+      <w:lvlText w:val="%8."/>
+      <w:lvlJc w:val="left"/>
+      <w:pPr>
+        <w:ind w:left="6609" w:hanging="360"/>
+      </w:pPr>
+    </w:lvl>
+    <w:lvl w:ilvl="8" w:tplc="0419001B" w:tentative="1">
+      <w:start w:val="1"/>
+      <w:numFmt w:val="lowerRoman"/>
+      <w:lvlText w:val="%9."/>
+      <w:lvlJc w:val="right"/>
+      <w:pPr>
+        <w:ind w:left="7329" w:hanging="180"/>
+      </w:pPr>
+    </w:lvl>
+  </w:abstractNum>
   <w:num w:numId="1" w16cid:durableId="1586188027">
+    <w:abstractNumId w:val="8"/>
+  </w:num>
+  <w:num w:numId="2" w16cid:durableId="976954538">
+    <w:abstractNumId w:val="3"/>
+  </w:num>
+  <w:num w:numId="3" w16cid:durableId="79376324">
+    <w:abstractNumId w:val="9"/>
+  </w:num>
+  <w:num w:numId="4" w16cid:durableId="146553367">
+    <w:abstractNumId w:val="4"/>
+  </w:num>
+  <w:num w:numId="5" w16cid:durableId="593592315">
+    <w:abstractNumId w:val="13"/>
+  </w:num>
+  <w:num w:numId="6" w16cid:durableId="444809084">
+    <w:abstractNumId w:val="10"/>
+  </w:num>
+  <w:num w:numId="7" w16cid:durableId="1455440981">
+    <w:abstractNumId w:val="14"/>
+  </w:num>
+  <w:num w:numId="8" w16cid:durableId="907574375">
+    <w:abstractNumId w:val="5"/>
+  </w:num>
+  <w:num w:numId="9" w16cid:durableId="742601236">
     <w:abstractNumId w:val="7"/>
   </w:num>
-  <w:num w:numId="2" w16cid:durableId="976954538">
+  <w:num w:numId="10" w16cid:durableId="529539489">
     <w:abstractNumId w:val="2"/>
   </w:num>
-  <w:num w:numId="3" w16cid:durableId="79376324">
-    <w:abstractNumId w:val="8"/>
-  </w:num>
-  <w:num w:numId="4" w16cid:durableId="146553367">
-    <w:abstractNumId w:val="3"/>
-  </w:num>
-  <w:num w:numId="5" w16cid:durableId="593592315">
+  <w:num w:numId="11" w16cid:durableId="1419328994">
     <w:abstractNumId w:val="11"/>
   </w:num>
-  <w:num w:numId="6" w16cid:durableId="444809084">
-    <w:abstractNumId w:val="9"/>
-  </w:num>
-  <w:num w:numId="7" w16cid:durableId="1455440981">
-    <w:abstractNumId w:val="12"/>
-  </w:num>
-  <w:num w:numId="8" w16cid:durableId="907574375">
-    <w:abstractNumId w:val="4"/>
-  </w:num>
-  <w:num w:numId="9" w16cid:durableId="742601236">
+  <w:num w:numId="12" w16cid:durableId="405811273">
     <w:abstractNumId w:val="6"/>
   </w:num>
-  <w:num w:numId="10" w16cid:durableId="529539489">
+  <w:num w:numId="13" w16cid:durableId="575896056">
     <w:abstractNumId w:val="1"/>
   </w:num>
-  <w:num w:numId="11" w16cid:durableId="1419328994">
-    <w:abstractNumId w:val="10"/>
+  <w:num w:numId="14" w16cid:durableId="2066101151">
+    <w:abstractNumId w:val="0"/>
   </w:num>
-  <w:num w:numId="12" w16cid:durableId="405811273">
-    <w:abstractNumId w:val="5"/>
+  <w:num w:numId="15" w16cid:durableId="226452415">
+    <w:abstractNumId w:val="15"/>
   </w:num>
-  <w:num w:numId="13" w16cid:durableId="575896056">
-    <w:abstractNumId w:val="0"/>
+  <w:num w:numId="16" w16cid:durableId="260527771">
+    <w:abstractNumId w:val="12"/>
   </w:num>
 </w:numbering>
 </file>

</xml_diff>

<commit_message>
UPDATE: отчет DATE: 2026-09-18 03:58:11
</commit_message>
<xml_diff>
--- a/Учеба 4 семестр/ОСИ/3 ЛАБ/Отчет.docx
+++ b/Учеба 4 семестр/ОСИ/3 ЛАБ/Отчет.docx
@@ -1308,17 +1308,12 @@
         <w:t xml:space="preserve">од Грея - просто число, полученное по формуле: </w:t>
       </w:r>
       <w:proofErr w:type="spellStart"/>
-      <w:proofErr w:type="gramStart"/>
       <w:r>
         <w:t>index</w:t>
       </w:r>
       <w:proofErr w:type="spellEnd"/>
       <w:r>
-        <w:t>(</w:t>
-      </w:r>
-      <w:proofErr w:type="gramEnd"/>
-      <w:r>
-        <w:t>текущая задача) XOR (</w:t>
+        <w:t>(текущая задача) XOR (</w:t>
       </w:r>
       <w:proofErr w:type="spellStart"/>
       <w:r>
@@ -1351,13 +1346,8 @@
         <w:jc w:val="both"/>
       </w:pPr>
       <w:r>
-        <w:t>Сдвигаем Г</w:t>
-      </w:r>
-      <w:proofErr w:type="gramStart"/>
-      <w:r>
-        <w:t>&gt;&gt;k</w:t>
-      </w:r>
-      <w:proofErr w:type="gramEnd"/>
+        <w:t>Сдвигаем Г&gt;&gt;k</w:t>
+      </w:r>
     </w:p>
     <w:p>
       <w:pPr>
@@ -1684,7 +1674,6 @@
               <w:jc w:val="both"/>
             </w:pPr>
             <w:proofErr w:type="spellStart"/>
-            <w:proofErr w:type="gramStart"/>
             <w:r>
               <w:rPr>
                 <w:b/>
@@ -1698,15 +1687,7 @@
                 <w:b/>
                 <w:bCs/>
               </w:rPr>
-              <w:t>(</w:t>
-            </w:r>
-            <w:proofErr w:type="gramEnd"/>
-            <w:r>
-              <w:rPr>
-                <w:b/>
-                <w:bCs/>
-              </w:rPr>
-              <w:t>)</w:t>
+              <w:t>()</w:t>
             </w:r>
           </w:p>
         </w:tc>
@@ -1771,15 +1752,7 @@
                 <w:b/>
                 <w:bCs/>
               </w:rPr>
-              <w:t>open_file_and_</w:t>
-            </w:r>
-            <w:proofErr w:type="gramStart"/>
-            <w:r>
-              <w:rPr>
-                <w:b/>
-                <w:bCs/>
-              </w:rPr>
-              <w:t>scan</w:t>
+              <w:t>open_file_and_scan</w:t>
             </w:r>
             <w:proofErr w:type="spellEnd"/>
             <w:r>
@@ -1787,15 +1760,7 @@
                 <w:b/>
                 <w:bCs/>
               </w:rPr>
-              <w:t>(</w:t>
-            </w:r>
-            <w:proofErr w:type="gramEnd"/>
-            <w:r>
-              <w:rPr>
-                <w:b/>
-                <w:bCs/>
-              </w:rPr>
-              <w:t>)</w:t>
+              <w:t>()</w:t>
             </w:r>
           </w:p>
         </w:tc>
@@ -1860,15 +1825,7 @@
                 <w:b/>
                 <w:bCs/>
               </w:rPr>
-              <w:t>time_to_</w:t>
-            </w:r>
-            <w:proofErr w:type="gramStart"/>
-            <w:r>
-              <w:rPr>
-                <w:b/>
-                <w:bCs/>
-              </w:rPr>
-              <w:t>file</w:t>
+              <w:t>time_to_file</w:t>
             </w:r>
             <w:proofErr w:type="spellEnd"/>
             <w:r>
@@ -1876,15 +1833,7 @@
                 <w:b/>
                 <w:bCs/>
               </w:rPr>
-              <w:t>(</w:t>
-            </w:r>
-            <w:proofErr w:type="gramEnd"/>
-            <w:r>
-              <w:rPr>
-                <w:b/>
-                <w:bCs/>
-              </w:rPr>
-              <w:t>)</w:t>
+              <w:t>()</w:t>
             </w:r>
           </w:p>
         </w:tc>
@@ -1949,15 +1898,7 @@
                 <w:b/>
                 <w:bCs/>
               </w:rPr>
-              <w:t>result_to_</w:t>
-            </w:r>
-            <w:proofErr w:type="gramStart"/>
-            <w:r>
-              <w:rPr>
-                <w:b/>
-                <w:bCs/>
-              </w:rPr>
-              <w:t>file</w:t>
+              <w:t>result_to_file</w:t>
             </w:r>
             <w:proofErr w:type="spellEnd"/>
             <w:r>
@@ -1965,15 +1906,7 @@
                 <w:b/>
                 <w:bCs/>
               </w:rPr>
-              <w:t>(</w:t>
-            </w:r>
-            <w:proofErr w:type="gramEnd"/>
-            <w:r>
-              <w:rPr>
-                <w:b/>
-                <w:bCs/>
-              </w:rPr>
-              <w:t>)</w:t>
+              <w:t>()</w:t>
             </w:r>
           </w:p>
         </w:tc>
@@ -2038,15 +1971,7 @@
                 <w:b/>
                 <w:bCs/>
               </w:rPr>
-              <w:t>total_</w:t>
-            </w:r>
-            <w:proofErr w:type="gramStart"/>
-            <w:r>
-              <w:rPr>
-                <w:b/>
-                <w:bCs/>
-              </w:rPr>
-              <w:t>combinations</w:t>
+              <w:t>total_combinations</w:t>
             </w:r>
             <w:proofErr w:type="spellEnd"/>
             <w:r>
@@ -2054,15 +1979,7 @@
                 <w:b/>
                 <w:bCs/>
               </w:rPr>
-              <w:t>(</w:t>
-            </w:r>
-            <w:proofErr w:type="gramEnd"/>
-            <w:r>
-              <w:rPr>
-                <w:b/>
-                <w:bCs/>
-              </w:rPr>
-              <w:t>)</w:t>
+              <w:t>()</w:t>
             </w:r>
           </w:p>
         </w:tc>
@@ -2131,16 +2048,7 @@
                 <w:bCs/>
                 <w:lang w:val="en-US"/>
               </w:rPr>
-              <w:t>check_</w:t>
-            </w:r>
-            <w:proofErr w:type="gramStart"/>
-            <w:r>
-              <w:rPr>
-                <w:b/>
-                <w:bCs/>
-                <w:lang w:val="en-US"/>
-              </w:rPr>
-              <w:t>combination</w:t>
+              <w:t>check_combination</w:t>
             </w:r>
             <w:proofErr w:type="spellEnd"/>
             <w:r>
@@ -2149,16 +2057,7 @@
                 <w:bCs/>
                 <w:lang w:val="en-US"/>
               </w:rPr>
-              <w:t>(</w:t>
-            </w:r>
-            <w:proofErr w:type="gramEnd"/>
-            <w:r>
-              <w:rPr>
-                <w:b/>
-                <w:bCs/>
-                <w:lang w:val="en-US"/>
-              </w:rPr>
-              <w:t xml:space="preserve">LL </w:t>
+              <w:t xml:space="preserve">(LL </w:t>
             </w:r>
             <w:proofErr w:type="spellStart"/>
             <w:r>
@@ -2241,15 +2140,7 @@
                 <w:b/>
                 <w:bCs/>
               </w:rPr>
-              <w:t>worker_</w:t>
-            </w:r>
-            <w:proofErr w:type="gramStart"/>
-            <w:r>
-              <w:rPr>
-                <w:b/>
-                <w:bCs/>
-              </w:rPr>
-              <w:t>thread</w:t>
+              <w:t>worker_thread</w:t>
             </w:r>
             <w:proofErr w:type="spellEnd"/>
             <w:r>
@@ -2257,15 +2148,7 @@
                 <w:b/>
                 <w:bCs/>
               </w:rPr>
-              <w:t>(</w:t>
-            </w:r>
-            <w:proofErr w:type="gramEnd"/>
-            <w:r>
-              <w:rPr>
-                <w:b/>
-                <w:bCs/>
-              </w:rPr>
-              <w:t xml:space="preserve">LPVOID </w:t>
+              <w:t xml:space="preserve">(LPVOID </w:t>
             </w:r>
             <w:proofErr w:type="spellStart"/>
             <w:r>
@@ -2350,16 +2233,7 @@
                 <w:bCs/>
                 <w:lang w:val="en-US"/>
               </w:rPr>
-              <w:t>number_of_</w:t>
-            </w:r>
-            <w:proofErr w:type="gramStart"/>
-            <w:r>
-              <w:rPr>
-                <w:b/>
-                <w:bCs/>
-                <w:lang w:val="en-US"/>
-              </w:rPr>
-              <w:t>digits</w:t>
+              <w:t>number_of_digits</w:t>
             </w:r>
             <w:proofErr w:type="spellEnd"/>
             <w:r>
@@ -2368,16 +2242,7 @@
                 <w:bCs/>
                 <w:lang w:val="en-US"/>
               </w:rPr>
-              <w:t>(</w:t>
-            </w:r>
-            <w:proofErr w:type="gramEnd"/>
-            <w:r>
-              <w:rPr>
-                <w:b/>
-                <w:bCs/>
-                <w:lang w:val="en-US"/>
-              </w:rPr>
-              <w:t xml:space="preserve">LL </w:t>
+              <w:t xml:space="preserve">(LL </w:t>
             </w:r>
             <w:proofErr w:type="spellStart"/>
             <w:r>
@@ -3799,7 +3664,575 @@
         <w:pStyle w:val="ac"/>
         <w:spacing w:before="183" w:line="309" w:lineRule="auto"/>
         <w:ind w:left="873" w:right="163"/>
-      </w:pPr>
+        <w:rPr>
+          <w:noProof/>
+        </w:rPr>
+      </w:pPr>
+    </w:p>
+    <w:p>
+      <w:pPr>
+        <w:pStyle w:val="ac"/>
+        <w:spacing w:before="183" w:line="309" w:lineRule="auto"/>
+        <w:ind w:left="873" w:right="163"/>
+        <w:jc w:val="center"/>
+        <w:rPr>
+          <w:noProof/>
+        </w:rPr>
+      </w:pPr>
+    </w:p>
+    <w:p>
+      <w:pPr>
+        <w:pStyle w:val="ac"/>
+        <w:spacing w:before="183" w:line="309" w:lineRule="auto"/>
+        <w:ind w:left="873" w:right="163"/>
+        <w:jc w:val="center"/>
+      </w:pPr>
+      <w:r>
+        <w:rPr>
+          <w:noProof/>
+        </w:rPr>
+        <w:lastRenderedPageBreak/>
+        <w:drawing>
+          <wp:inline distT="0" distB="0" distL="0" distR="0" wp14:anchorId="3272E529" wp14:editId="0FB61CD2">
+            <wp:extent cx="5056734" cy="8515350"/>
+            <wp:effectExtent l="0" t="0" r="0" b="0"/>
+            <wp:docPr id="12" name="Рисунок 12"/>
+            <wp:cNvGraphicFramePr>
+              <a:graphicFrameLocks xmlns:a="http://schemas.openxmlformats.org/drawingml/2006/main" noChangeAspect="1"/>
+            </wp:cNvGraphicFramePr>
+            <a:graphic xmlns:a="http://schemas.openxmlformats.org/drawingml/2006/main">
+              <a:graphicData uri="http://schemas.openxmlformats.org/drawingml/2006/picture">
+                <pic:pic xmlns:pic="http://schemas.openxmlformats.org/drawingml/2006/picture">
+                  <pic:nvPicPr>
+                    <pic:cNvPr id="0" name="Picture 18"/>
+                    <pic:cNvPicPr>
+                      <a:picLocks noChangeAspect="1" noChangeArrowheads="1"/>
+                    </pic:cNvPicPr>
+                  </pic:nvPicPr>
+                  <pic:blipFill rotWithShape="1">
+                    <a:blip r:embed="rId14" cstate="print">
+                      <a:extLst>
+                        <a:ext uri="{28A0092B-C50C-407E-A947-70E740481C1C}">
+                          <a14:useLocalDpi xmlns:a14="http://schemas.microsoft.com/office/drawing/2010/main" val="0"/>
+                        </a:ext>
+                      </a:extLst>
+                    </a:blip>
+                    <a:srcRect t="1923"/>
+                    <a:stretch/>
+                  </pic:blipFill>
+                  <pic:spPr bwMode="auto">
+                    <a:xfrm>
+                      <a:off x="0" y="0"/>
+                      <a:ext cx="5064840" cy="8529001"/>
+                    </a:xfrm>
+                    <a:prstGeom prst="rect">
+                      <a:avLst/>
+                    </a:prstGeom>
+                    <a:noFill/>
+                    <a:ln>
+                      <a:noFill/>
+                    </a:ln>
+                    <a:extLst>
+                      <a:ext uri="{53640926-AAD7-44D8-BBD7-CCE9431645EC}">
+                        <a14:shadowObscured xmlns:a14="http://schemas.microsoft.com/office/drawing/2010/main"/>
+                      </a:ext>
+                    </a:extLst>
+                  </pic:spPr>
+                </pic:pic>
+              </a:graphicData>
+            </a:graphic>
+          </wp:inline>
+        </w:drawing>
+      </w:r>
+    </w:p>
+    <w:p>
+      <w:pPr>
+        <w:pStyle w:val="ac"/>
+        <w:spacing w:before="183" w:line="309" w:lineRule="auto"/>
+        <w:ind w:left="873" w:right="163"/>
+        <w:jc w:val="center"/>
+      </w:pPr>
+      <w:r>
+        <w:t>Рисунок 10. Блок-схема алгоритма</w:t>
+      </w:r>
+    </w:p>
+    <w:p>
+      <w:pPr>
+        <w:pStyle w:val="ac"/>
+        <w:spacing w:before="183" w:line="309" w:lineRule="auto"/>
+        <w:ind w:left="873" w:right="163"/>
+        <w:jc w:val="center"/>
+        <w:rPr>
+          <w:noProof/>
+        </w:rPr>
+      </w:pPr>
+    </w:p>
+    <w:p>
+      <w:pPr>
+        <w:pStyle w:val="ac"/>
+        <w:spacing w:before="183" w:line="309" w:lineRule="auto"/>
+        <w:ind w:left="873" w:right="163"/>
+        <w:jc w:val="center"/>
+      </w:pPr>
+      <w:r>
+        <w:rPr>
+          <w:noProof/>
+        </w:rPr>
+        <w:drawing>
+          <wp:inline distT="0" distB="0" distL="0" distR="0" wp14:anchorId="3FA8EC13" wp14:editId="198C9B74">
+            <wp:extent cx="5224920" cy="2736850"/>
+            <wp:effectExtent l="0" t="0" r="0" b="6350"/>
+            <wp:docPr id="13" name="Рисунок 13"/>
+            <wp:cNvGraphicFramePr>
+              <a:graphicFrameLocks xmlns:a="http://schemas.openxmlformats.org/drawingml/2006/main" noChangeAspect="1"/>
+            </wp:cNvGraphicFramePr>
+            <a:graphic xmlns:a="http://schemas.openxmlformats.org/drawingml/2006/main">
+              <a:graphicData uri="http://schemas.openxmlformats.org/drawingml/2006/picture">
+                <pic:pic xmlns:pic="http://schemas.openxmlformats.org/drawingml/2006/picture">
+                  <pic:nvPicPr>
+                    <pic:cNvPr id="0" name="Picture 19"/>
+                    <pic:cNvPicPr>
+                      <a:picLocks noChangeAspect="1" noChangeArrowheads="1"/>
+                    </pic:cNvPicPr>
+                  </pic:nvPicPr>
+                  <pic:blipFill rotWithShape="1">
+                    <a:blip r:embed="rId15" cstate="print">
+                      <a:extLst>
+                        <a:ext uri="{28A0092B-C50C-407E-A947-70E740481C1C}">
+                          <a14:useLocalDpi xmlns:a14="http://schemas.microsoft.com/office/drawing/2010/main" val="0"/>
+                        </a:ext>
+                      </a:extLst>
+                    </a:blip>
+                    <a:srcRect b="6182"/>
+                    <a:stretch/>
+                  </pic:blipFill>
+                  <pic:spPr bwMode="auto">
+                    <a:xfrm>
+                      <a:off x="0" y="0"/>
+                      <a:ext cx="5234536" cy="2741887"/>
+                    </a:xfrm>
+                    <a:prstGeom prst="rect">
+                      <a:avLst/>
+                    </a:prstGeom>
+                    <a:noFill/>
+                    <a:ln>
+                      <a:noFill/>
+                    </a:ln>
+                    <a:extLst>
+                      <a:ext uri="{53640926-AAD7-44D8-BBD7-CCE9431645EC}">
+                        <a14:shadowObscured xmlns:a14="http://schemas.microsoft.com/office/drawing/2010/main"/>
+                      </a:ext>
+                    </a:extLst>
+                  </pic:spPr>
+                </pic:pic>
+              </a:graphicData>
+            </a:graphic>
+          </wp:inline>
+        </w:drawing>
+      </w:r>
+    </w:p>
+    <w:p>
+      <w:pPr>
+        <w:pStyle w:val="ac"/>
+        <w:spacing w:before="183" w:line="309" w:lineRule="auto"/>
+        <w:ind w:left="873" w:right="163"/>
+        <w:jc w:val="center"/>
+      </w:pPr>
+      <w:r>
+        <w:t>Рисунок 11. Временная диаграмма потоков</w:t>
+      </w:r>
+    </w:p>
+    <w:p>
+      <w:pPr>
+        <w:pStyle w:val="ac"/>
+        <w:numPr>
+          <w:ilvl w:val="1"/>
+          <w:numId w:val="2"/>
+        </w:numPr>
+        <w:spacing w:before="183" w:line="309" w:lineRule="auto"/>
+        <w:ind w:right="163"/>
+      </w:pPr>
+      <w:r>
+        <w:t>Шахматы</w:t>
+      </w:r>
+    </w:p>
+    <w:p>
+      <w:pPr>
+        <w:pStyle w:val="ac"/>
+        <w:spacing w:before="183" w:line="309" w:lineRule="auto"/>
+        <w:ind w:right="163"/>
+      </w:pPr>
+      <w:r>
+        <w:t xml:space="preserve">Нужно решить задачу по расстановке на шахматной доске размером </w:t>
+      </w:r>
+      <w:proofErr w:type="spellStart"/>
+      <w:r>
+        <w:rPr>
+          <w:lang w:val="en-US"/>
+        </w:rPr>
+        <w:t>NxN</w:t>
+      </w:r>
+      <w:proofErr w:type="spellEnd"/>
+      <w:r>
+        <w:t xml:space="preserve"> </w:t>
+      </w:r>
+      <w:r>
+        <w:rPr>
+          <w:lang w:val="en-US"/>
+        </w:rPr>
+        <w:t>L</w:t>
+      </w:r>
+      <w:r>
+        <w:t xml:space="preserve"> </w:t>
+      </w:r>
+      <w:r>
+        <w:t xml:space="preserve">ладей так, чтобы они не били друг друга и </w:t>
+      </w:r>
+      <w:r>
+        <w:rPr>
+          <w:lang w:val="en-US"/>
+        </w:rPr>
+        <w:t>K</w:t>
+      </w:r>
+      <w:r>
+        <w:t xml:space="preserve"> </w:t>
+      </w:r>
+      <w:r>
+        <w:t xml:space="preserve">ладей, которые изначально стояли на доске. </w:t>
+      </w:r>
+    </w:p>
+    <w:p>
+      <w:pPr>
+        <w:pStyle w:val="ac"/>
+        <w:spacing w:before="183" w:line="309" w:lineRule="auto"/>
+        <w:ind w:right="163"/>
+      </w:pPr>
+      <w:r>
+        <w:t xml:space="preserve">Описание алгоритма: </w:t>
+      </w:r>
+    </w:p>
+    <w:p>
+      <w:pPr>
+        <w:pStyle w:val="ac"/>
+        <w:numPr>
+          <w:ilvl w:val="0"/>
+          <w:numId w:val="17"/>
+        </w:numPr>
+        <w:spacing w:before="183" w:line="309" w:lineRule="auto"/>
+        <w:ind w:right="163"/>
+      </w:pPr>
+      <w:r>
+        <w:t>Считывание параметров</w:t>
+      </w:r>
+    </w:p>
+    <w:p>
+      <w:pPr>
+        <w:pStyle w:val="ac"/>
+        <w:numPr>
+          <w:ilvl w:val="0"/>
+          <w:numId w:val="17"/>
+        </w:numPr>
+        <w:spacing w:before="183" w:line="309" w:lineRule="auto"/>
+        <w:ind w:right="163"/>
+      </w:pPr>
+      <w:r>
+        <w:t xml:space="preserve">Создание структуры для каждого потока </w:t>
+      </w:r>
+    </w:p>
+    <w:p>
+      <w:pPr>
+        <w:pStyle w:val="ac"/>
+        <w:numPr>
+          <w:ilvl w:val="0"/>
+          <w:numId w:val="17"/>
+        </w:numPr>
+        <w:spacing w:before="183" w:line="309" w:lineRule="auto"/>
+        <w:ind w:right="163"/>
+      </w:pPr>
+      <w:r>
+        <w:t>Выделение памяти под потоки, зафиксировать время</w:t>
+      </w:r>
+    </w:p>
+    <w:p>
+      <w:pPr>
+        <w:pStyle w:val="ac"/>
+        <w:numPr>
+          <w:ilvl w:val="0"/>
+          <w:numId w:val="17"/>
+        </w:numPr>
+        <w:spacing w:before="183" w:line="309" w:lineRule="auto"/>
+        <w:ind w:right="163"/>
+      </w:pPr>
+      <w:r>
+        <w:t xml:space="preserve">Пока задачи не превысили изначальное количество задач: выполняем </w:t>
+      </w:r>
+      <w:r>
+        <w:rPr>
+          <w:lang w:val="en-US"/>
+        </w:rPr>
+        <w:t>logic</w:t>
+      </w:r>
+      <w:r>
+        <w:t>()</w:t>
+      </w:r>
+      <w:r>
+        <w:t xml:space="preserve">. </w:t>
+      </w:r>
+    </w:p>
+    <w:p>
+      <w:pPr>
+        <w:pStyle w:val="ac"/>
+        <w:numPr>
+          <w:ilvl w:val="0"/>
+          <w:numId w:val="17"/>
+        </w:numPr>
+        <w:spacing w:before="183" w:line="309" w:lineRule="auto"/>
+        <w:ind w:right="163"/>
+      </w:pPr>
+      <w:r>
+        <w:t xml:space="preserve">Под критической секцией изменяем </w:t>
+      </w:r>
+      <w:r>
+        <w:rPr>
+          <w:lang w:val="en-US"/>
+        </w:rPr>
+        <w:t>next</w:t>
+      </w:r>
+      <w:r>
+        <w:t>_</w:t>
+      </w:r>
+      <w:r>
+        <w:rPr>
+          <w:lang w:val="en-US"/>
+        </w:rPr>
+        <w:t>task</w:t>
+      </w:r>
+    </w:p>
+    <w:p>
+      <w:pPr>
+        <w:pStyle w:val="ac"/>
+        <w:numPr>
+          <w:ilvl w:val="0"/>
+          <w:numId w:val="17"/>
+        </w:numPr>
+        <w:spacing w:before="183" w:line="309" w:lineRule="auto"/>
+        <w:ind w:right="163"/>
+      </w:pPr>
+      <w:r>
+        <w:t>Если задач больше нет, завершение работы</w:t>
+      </w:r>
+    </w:p>
+    <w:p>
+      <w:pPr>
+        <w:pStyle w:val="ac"/>
+        <w:spacing w:before="183" w:line="309" w:lineRule="auto"/>
+        <w:ind w:right="163"/>
+        <w:jc w:val="center"/>
+      </w:pPr>
+    </w:p>
+    <w:p>
+      <w:pPr>
+        <w:pStyle w:val="ac"/>
+        <w:spacing w:before="183" w:line="309" w:lineRule="auto"/>
+        <w:ind w:right="163"/>
+        <w:jc w:val="center"/>
+        <w:rPr>
+          <w:noProof/>
+        </w:rPr>
+      </w:pPr>
+    </w:p>
+    <w:p>
+      <w:pPr>
+        <w:pStyle w:val="ac"/>
+        <w:spacing w:before="183" w:line="309" w:lineRule="auto"/>
+        <w:ind w:right="163"/>
+        <w:jc w:val="center"/>
+      </w:pPr>
+      <w:r>
+        <w:rPr>
+          <w:noProof/>
+        </w:rPr>
+        <w:lastRenderedPageBreak/>
+        <w:drawing>
+          <wp:inline distT="0" distB="0" distL="0" distR="0" wp14:anchorId="4C3AEE58" wp14:editId="3496EF04">
+            <wp:extent cx="5932805" cy="6694805"/>
+            <wp:effectExtent l="0" t="0" r="0" b="0"/>
+            <wp:docPr id="14" name="Рисунок 14"/>
+            <wp:cNvGraphicFramePr>
+              <a:graphicFrameLocks xmlns:a="http://schemas.openxmlformats.org/drawingml/2006/main" noChangeAspect="1"/>
+            </wp:cNvGraphicFramePr>
+            <a:graphic xmlns:a="http://schemas.openxmlformats.org/drawingml/2006/main">
+              <a:graphicData uri="http://schemas.openxmlformats.org/drawingml/2006/picture">
+                <pic:pic xmlns:pic="http://schemas.openxmlformats.org/drawingml/2006/picture">
+                  <pic:nvPicPr>
+                    <pic:cNvPr id="0" name="Picture 20"/>
+                    <pic:cNvPicPr>
+                      <a:picLocks noChangeAspect="1" noChangeArrowheads="1"/>
+                    </pic:cNvPicPr>
+                  </pic:nvPicPr>
+                  <pic:blipFill rotWithShape="1">
+                    <a:blip r:embed="rId16" cstate="print">
+                      <a:extLst>
+                        <a:ext uri="{28A0092B-C50C-407E-A947-70E740481C1C}">
+                          <a14:useLocalDpi xmlns:a14="http://schemas.microsoft.com/office/drawing/2010/main" val="0"/>
+                        </a:ext>
+                      </a:extLst>
+                    </a:blip>
+                    <a:srcRect t="2225"/>
+                    <a:stretch/>
+                  </pic:blipFill>
+                  <pic:spPr bwMode="auto">
+                    <a:xfrm>
+                      <a:off x="0" y="0"/>
+                      <a:ext cx="5932805" cy="6694805"/>
+                    </a:xfrm>
+                    <a:prstGeom prst="rect">
+                      <a:avLst/>
+                    </a:prstGeom>
+                    <a:noFill/>
+                    <a:ln>
+                      <a:noFill/>
+                    </a:ln>
+                    <a:extLst>
+                      <a:ext uri="{53640926-AAD7-44D8-BBD7-CCE9431645EC}">
+                        <a14:shadowObscured xmlns:a14="http://schemas.microsoft.com/office/drawing/2010/main"/>
+                      </a:ext>
+                    </a:extLst>
+                  </pic:spPr>
+                </pic:pic>
+              </a:graphicData>
+            </a:graphic>
+          </wp:inline>
+        </w:drawing>
+      </w:r>
+    </w:p>
+    <w:p>
+      <w:pPr>
+        <w:pStyle w:val="ac"/>
+        <w:spacing w:before="183" w:line="309" w:lineRule="auto"/>
+        <w:ind w:right="163"/>
+        <w:jc w:val="center"/>
+      </w:pPr>
+      <w:r>
+        <w:t>Рисунок 12. Блок-схема алгоритма</w:t>
+      </w:r>
+    </w:p>
+    <w:p>
+      <w:pPr>
+        <w:pStyle w:val="ac"/>
+        <w:spacing w:before="183" w:line="309" w:lineRule="auto"/>
+        <w:ind w:right="163"/>
+        <w:rPr>
+          <w:noProof/>
+        </w:rPr>
+      </w:pPr>
+    </w:p>
+    <w:p>
+      <w:pPr>
+        <w:pStyle w:val="ac"/>
+        <w:spacing w:before="183" w:line="309" w:lineRule="auto"/>
+        <w:ind w:right="163"/>
+      </w:pPr>
+      <w:r>
+        <w:rPr>
+          <w:noProof/>
+        </w:rPr>
+        <w:lastRenderedPageBreak/>
+        <w:drawing>
+          <wp:inline distT="0" distB="0" distL="0" distR="0" wp14:anchorId="1A7D634D" wp14:editId="5E36A2D7">
+            <wp:extent cx="5932170" cy="2550160"/>
+            <wp:effectExtent l="0" t="0" r="0" b="2540"/>
+            <wp:docPr id="15" name="Рисунок 15"/>
+            <wp:cNvGraphicFramePr>
+              <a:graphicFrameLocks xmlns:a="http://schemas.openxmlformats.org/drawingml/2006/main" noChangeAspect="1"/>
+            </wp:cNvGraphicFramePr>
+            <a:graphic xmlns:a="http://schemas.openxmlformats.org/drawingml/2006/main">
+              <a:graphicData uri="http://schemas.openxmlformats.org/drawingml/2006/picture">
+                <pic:pic xmlns:pic="http://schemas.openxmlformats.org/drawingml/2006/picture">
+                  <pic:nvPicPr>
+                    <pic:cNvPr id="0" name="Picture 21"/>
+                    <pic:cNvPicPr>
+                      <a:picLocks noChangeAspect="1" noChangeArrowheads="1"/>
+                    </pic:cNvPicPr>
+                  </pic:nvPicPr>
+                  <pic:blipFill rotWithShape="1">
+                    <a:blip r:embed="rId17" cstate="print">
+                      <a:extLst>
+                        <a:ext uri="{28A0092B-C50C-407E-A947-70E740481C1C}">
+                          <a14:useLocalDpi xmlns:a14="http://schemas.microsoft.com/office/drawing/2010/main" val="0"/>
+                        </a:ext>
+                      </a:extLst>
+                    </a:blip>
+                    <a:srcRect b="4762"/>
+                    <a:stretch/>
+                  </pic:blipFill>
+                  <pic:spPr bwMode="auto">
+                    <a:xfrm>
+                      <a:off x="0" y="0"/>
+                      <a:ext cx="5948935" cy="2557367"/>
+                    </a:xfrm>
+                    <a:prstGeom prst="rect">
+                      <a:avLst/>
+                    </a:prstGeom>
+                    <a:noFill/>
+                    <a:ln>
+                      <a:noFill/>
+                    </a:ln>
+                    <a:extLst>
+                      <a:ext uri="{53640926-AAD7-44D8-BBD7-CCE9431645EC}">
+                        <a14:shadowObscured xmlns:a14="http://schemas.microsoft.com/office/drawing/2010/main"/>
+                      </a:ext>
+                    </a:extLst>
+                  </pic:spPr>
+                </pic:pic>
+              </a:graphicData>
+            </a:graphic>
+          </wp:inline>
+        </w:drawing>
+      </w:r>
+    </w:p>
+    <w:p>
+      <w:pPr>
+        <w:pStyle w:val="ac"/>
+        <w:spacing w:before="183" w:line="309" w:lineRule="auto"/>
+        <w:ind w:right="163"/>
+        <w:jc w:val="center"/>
+      </w:pPr>
+      <w:r>
+        <w:t xml:space="preserve">Рисунок 13. Временная диаграмма потоков </w:t>
+      </w:r>
+    </w:p>
+    <w:p>
+      <w:pPr>
+        <w:pStyle w:val="ac"/>
+        <w:spacing w:before="183" w:line="309" w:lineRule="auto"/>
+        <w:ind w:right="163"/>
+        <w:jc w:val="center"/>
+      </w:pPr>
+    </w:p>
+    <w:p>
+      <w:pPr>
+        <w:pStyle w:val="ac"/>
+        <w:numPr>
+          <w:ilvl w:val="0"/>
+          <w:numId w:val="2"/>
+        </w:numPr>
+        <w:spacing w:before="183" w:line="309" w:lineRule="auto"/>
+        <w:ind w:right="163"/>
+      </w:pPr>
+      <w:r>
+        <w:t xml:space="preserve">Выводы </w:t>
+      </w:r>
+    </w:p>
+    <w:p>
+      <w:pPr>
+        <w:pStyle w:val="ac"/>
+        <w:spacing w:before="183" w:line="309" w:lineRule="auto"/>
+        <w:ind w:right="163"/>
+      </w:pPr>
+      <w:r>
+        <w:t xml:space="preserve">В данной лабораторной работе были изучены механизмы многопоточности, синхронизации потоков. Улучшено умение распределения задач по потокам, работы с механизмами синхронизации. Реализованы 5 программ на изучение конструкций многопоточности. Составлены блок-схемы и временные диаграммы каждого алгоритма. </w:t>
+      </w:r>
     </w:p>
     <w:sectPr>
       <w:pgSz w:w="11906" w:h="16838"/>
@@ -4138,7 +4571,7 @@
       <w:lvlText w:val="%1."/>
       <w:lvlJc w:val="left"/>
       <w:pPr>
-        <w:ind w:left="1209" w:hanging="336"/>
+        <w:ind w:left="1186" w:hanging="336"/>
       </w:pPr>
       <w:rPr>
         <w:rFonts w:ascii="Times New Roman" w:eastAsia="Times New Roman" w:hAnsi="Times New Roman" w:cs="Times New Roman" w:hint="default"/>
@@ -4260,428 +4693,16 @@
     </w:lvl>
   </w:abstractNum>
   <w:abstractNum w:abstractNumId="4" w15:restartNumberingAfterBreak="0">
-    <w:nsid w:val="3FA71F67"/>
-    <w:multiLevelType w:val="hybridMultilevel"/>
-    <w:tmpl w:val="5B822446"/>
-    <w:lvl w:ilvl="0" w:tplc="63E6E15E">
+    <w:nsid w:val="3C6540AF"/>
+    <w:multiLevelType w:val="multilevel"/>
+    <w:tmpl w:val="BB846066"/>
+    <w:lvl w:ilvl="0">
       <w:start w:val="1"/>
       <w:numFmt w:val="decimal"/>
       <w:lvlText w:val="%1."/>
       <w:lvlJc w:val="left"/>
       <w:pPr>
-        <w:ind w:left="1080" w:hanging="360"/>
-      </w:pPr>
-      <w:rPr>
-        <w:rFonts w:hint="default"/>
-      </w:rPr>
-    </w:lvl>
-    <w:lvl w:ilvl="1" w:tplc="04190019" w:tentative="1">
-      <w:start w:val="1"/>
-      <w:numFmt w:val="lowerLetter"/>
-      <w:lvlText w:val="%2."/>
-      <w:lvlJc w:val="left"/>
-      <w:pPr>
-        <w:ind w:left="1800" w:hanging="360"/>
-      </w:pPr>
-    </w:lvl>
-    <w:lvl w:ilvl="2" w:tplc="0419001B" w:tentative="1">
-      <w:start w:val="1"/>
-      <w:numFmt w:val="lowerRoman"/>
-      <w:lvlText w:val="%3."/>
-      <w:lvlJc w:val="right"/>
-      <w:pPr>
-        <w:ind w:left="2520" w:hanging="180"/>
-      </w:pPr>
-    </w:lvl>
-    <w:lvl w:ilvl="3" w:tplc="0419000F" w:tentative="1">
-      <w:start w:val="1"/>
-      <w:numFmt w:val="decimal"/>
-      <w:lvlText w:val="%4."/>
-      <w:lvlJc w:val="left"/>
-      <w:pPr>
-        <w:ind w:left="3240" w:hanging="360"/>
-      </w:pPr>
-    </w:lvl>
-    <w:lvl w:ilvl="4" w:tplc="04190019" w:tentative="1">
-      <w:start w:val="1"/>
-      <w:numFmt w:val="lowerLetter"/>
-      <w:lvlText w:val="%5."/>
-      <w:lvlJc w:val="left"/>
-      <w:pPr>
-        <w:ind w:left="3960" w:hanging="360"/>
-      </w:pPr>
-    </w:lvl>
-    <w:lvl w:ilvl="5" w:tplc="0419001B" w:tentative="1">
-      <w:start w:val="1"/>
-      <w:numFmt w:val="lowerRoman"/>
-      <w:lvlText w:val="%6."/>
-      <w:lvlJc w:val="right"/>
-      <w:pPr>
-        <w:ind w:left="4680" w:hanging="180"/>
-      </w:pPr>
-    </w:lvl>
-    <w:lvl w:ilvl="6" w:tplc="0419000F" w:tentative="1">
-      <w:start w:val="1"/>
-      <w:numFmt w:val="decimal"/>
-      <w:lvlText w:val="%7."/>
-      <w:lvlJc w:val="left"/>
-      <w:pPr>
-        <w:ind w:left="5400" w:hanging="360"/>
-      </w:pPr>
-    </w:lvl>
-    <w:lvl w:ilvl="7" w:tplc="04190019" w:tentative="1">
-      <w:start w:val="1"/>
-      <w:numFmt w:val="lowerLetter"/>
-      <w:lvlText w:val="%8."/>
-      <w:lvlJc w:val="left"/>
-      <w:pPr>
-        <w:ind w:left="6120" w:hanging="360"/>
-      </w:pPr>
-    </w:lvl>
-    <w:lvl w:ilvl="8" w:tplc="0419001B" w:tentative="1">
-      <w:start w:val="1"/>
-      <w:numFmt w:val="lowerRoman"/>
-      <w:lvlText w:val="%9."/>
-      <w:lvlJc w:val="right"/>
-      <w:pPr>
-        <w:ind w:left="6840" w:hanging="180"/>
-      </w:pPr>
-    </w:lvl>
-  </w:abstractNum>
-  <w:abstractNum w:abstractNumId="5" w15:restartNumberingAfterBreak="0">
-    <w:nsid w:val="478A37B1"/>
-    <w:multiLevelType w:val="multilevel"/>
-    <w:tmpl w:val="A48048FC"/>
-    <w:lvl w:ilvl="0">
-      <w:start w:val="1"/>
-      <w:numFmt w:val="decimal"/>
-      <w:lvlText w:val="%1."/>
-      <w:lvlJc w:val="left"/>
-      <w:pPr>
-        <w:ind w:left="720" w:hanging="360"/>
-      </w:pPr>
-      <w:rPr>
-        <w:rFonts w:hint="default"/>
-      </w:rPr>
-    </w:lvl>
-    <w:lvl w:ilvl="1">
-      <w:start w:val="2"/>
-      <w:numFmt w:val="decimal"/>
-      <w:isLgl/>
-      <w:lvlText w:val="%1.%2."/>
-      <w:lvlJc w:val="left"/>
-      <w:pPr>
-        <w:ind w:left="1080" w:hanging="720"/>
-      </w:pPr>
-      <w:rPr>
-        <w:rFonts w:hint="default"/>
-      </w:rPr>
-    </w:lvl>
-    <w:lvl w:ilvl="2">
-      <w:start w:val="1"/>
-      <w:numFmt w:val="decimal"/>
-      <w:isLgl/>
-      <w:lvlText w:val="%1.%2.%3."/>
-      <w:lvlJc w:val="left"/>
-      <w:pPr>
-        <w:ind w:left="1080" w:hanging="720"/>
-      </w:pPr>
-      <w:rPr>
-        <w:rFonts w:hint="default"/>
-      </w:rPr>
-    </w:lvl>
-    <w:lvl w:ilvl="3">
-      <w:start w:val="1"/>
-      <w:numFmt w:val="decimal"/>
-      <w:isLgl/>
-      <w:lvlText w:val="%1.%2.%3.%4."/>
-      <w:lvlJc w:val="left"/>
-      <w:pPr>
-        <w:ind w:left="1440" w:hanging="1080"/>
-      </w:pPr>
-      <w:rPr>
-        <w:rFonts w:hint="default"/>
-      </w:rPr>
-    </w:lvl>
-    <w:lvl w:ilvl="4">
-      <w:start w:val="1"/>
-      <w:numFmt w:val="decimal"/>
-      <w:isLgl/>
-      <w:lvlText w:val="%1.%2.%3.%4.%5."/>
-      <w:lvlJc w:val="left"/>
-      <w:pPr>
-        <w:ind w:left="1440" w:hanging="1080"/>
-      </w:pPr>
-      <w:rPr>
-        <w:rFonts w:hint="default"/>
-      </w:rPr>
-    </w:lvl>
-    <w:lvl w:ilvl="5">
-      <w:start w:val="1"/>
-      <w:numFmt w:val="decimal"/>
-      <w:isLgl/>
-      <w:lvlText w:val="%1.%2.%3.%4.%5.%6."/>
-      <w:lvlJc w:val="left"/>
-      <w:pPr>
-        <w:ind w:left="1800" w:hanging="1440"/>
-      </w:pPr>
-      <w:rPr>
-        <w:rFonts w:hint="default"/>
-      </w:rPr>
-    </w:lvl>
-    <w:lvl w:ilvl="6">
-      <w:start w:val="1"/>
-      <w:numFmt w:val="decimal"/>
-      <w:isLgl/>
-      <w:lvlText w:val="%1.%2.%3.%4.%5.%6.%7."/>
-      <w:lvlJc w:val="left"/>
-      <w:pPr>
-        <w:ind w:left="2160" w:hanging="1800"/>
-      </w:pPr>
-      <w:rPr>
-        <w:rFonts w:hint="default"/>
-      </w:rPr>
-    </w:lvl>
-    <w:lvl w:ilvl="7">
-      <w:start w:val="1"/>
-      <w:numFmt w:val="decimal"/>
-      <w:isLgl/>
-      <w:lvlText w:val="%1.%2.%3.%4.%5.%6.%7.%8."/>
-      <w:lvlJc w:val="left"/>
-      <w:pPr>
-        <w:ind w:left="2160" w:hanging="1800"/>
-      </w:pPr>
-      <w:rPr>
-        <w:rFonts w:hint="default"/>
-      </w:rPr>
-    </w:lvl>
-    <w:lvl w:ilvl="8">
-      <w:start w:val="1"/>
-      <w:numFmt w:val="decimal"/>
-      <w:isLgl/>
-      <w:lvlText w:val="%1.%2.%3.%4.%5.%6.%7.%8.%9."/>
-      <w:lvlJc w:val="left"/>
-      <w:pPr>
-        <w:ind w:left="2520" w:hanging="2160"/>
-      </w:pPr>
-      <w:rPr>
-        <w:rFonts w:hint="default"/>
-      </w:rPr>
-    </w:lvl>
-  </w:abstractNum>
-  <w:abstractNum w:abstractNumId="6" w15:restartNumberingAfterBreak="0">
-    <w:nsid w:val="4E060336"/>
-    <w:multiLevelType w:val="hybridMultilevel"/>
-    <w:tmpl w:val="40DA588C"/>
-    <w:lvl w:ilvl="0" w:tplc="0419000F">
-      <w:start w:val="1"/>
-      <w:numFmt w:val="decimal"/>
-      <w:lvlText w:val="%1."/>
-      <w:lvlJc w:val="left"/>
-      <w:pPr>
-        <w:ind w:left="720" w:hanging="360"/>
-      </w:pPr>
-      <w:rPr>
-        <w:rFonts w:hint="default"/>
-      </w:rPr>
-    </w:lvl>
-    <w:lvl w:ilvl="1" w:tplc="04190019" w:tentative="1">
-      <w:start w:val="1"/>
-      <w:numFmt w:val="lowerLetter"/>
-      <w:lvlText w:val="%2."/>
-      <w:lvlJc w:val="left"/>
-      <w:pPr>
-        <w:ind w:left="1440" w:hanging="360"/>
-      </w:pPr>
-    </w:lvl>
-    <w:lvl w:ilvl="2" w:tplc="0419001B" w:tentative="1">
-      <w:start w:val="1"/>
-      <w:numFmt w:val="lowerRoman"/>
-      <w:lvlText w:val="%3."/>
-      <w:lvlJc w:val="right"/>
-      <w:pPr>
-        <w:ind w:left="2160" w:hanging="180"/>
-      </w:pPr>
-    </w:lvl>
-    <w:lvl w:ilvl="3" w:tplc="0419000F" w:tentative="1">
-      <w:start w:val="1"/>
-      <w:numFmt w:val="decimal"/>
-      <w:lvlText w:val="%4."/>
-      <w:lvlJc w:val="left"/>
-      <w:pPr>
-        <w:ind w:left="2880" w:hanging="360"/>
-      </w:pPr>
-    </w:lvl>
-    <w:lvl w:ilvl="4" w:tplc="04190019" w:tentative="1">
-      <w:start w:val="1"/>
-      <w:numFmt w:val="lowerLetter"/>
-      <w:lvlText w:val="%5."/>
-      <w:lvlJc w:val="left"/>
-      <w:pPr>
-        <w:ind w:left="3600" w:hanging="360"/>
-      </w:pPr>
-    </w:lvl>
-    <w:lvl w:ilvl="5" w:tplc="0419001B" w:tentative="1">
-      <w:start w:val="1"/>
-      <w:numFmt w:val="lowerRoman"/>
-      <w:lvlText w:val="%6."/>
-      <w:lvlJc w:val="right"/>
-      <w:pPr>
-        <w:ind w:left="4320" w:hanging="180"/>
-      </w:pPr>
-    </w:lvl>
-    <w:lvl w:ilvl="6" w:tplc="0419000F" w:tentative="1">
-      <w:start w:val="1"/>
-      <w:numFmt w:val="decimal"/>
-      <w:lvlText w:val="%7."/>
-      <w:lvlJc w:val="left"/>
-      <w:pPr>
-        <w:ind w:left="5040" w:hanging="360"/>
-      </w:pPr>
-    </w:lvl>
-    <w:lvl w:ilvl="7" w:tplc="04190019" w:tentative="1">
-      <w:start w:val="1"/>
-      <w:numFmt w:val="lowerLetter"/>
-      <w:lvlText w:val="%8."/>
-      <w:lvlJc w:val="left"/>
-      <w:pPr>
-        <w:ind w:left="5760" w:hanging="360"/>
-      </w:pPr>
-    </w:lvl>
-    <w:lvl w:ilvl="8" w:tplc="0419001B" w:tentative="1">
-      <w:start w:val="1"/>
-      <w:numFmt w:val="lowerRoman"/>
-      <w:lvlText w:val="%9."/>
-      <w:lvlJc w:val="right"/>
-      <w:pPr>
-        <w:ind w:left="6480" w:hanging="180"/>
-      </w:pPr>
-    </w:lvl>
-  </w:abstractNum>
-  <w:abstractNum w:abstractNumId="7" w15:restartNumberingAfterBreak="0">
-    <w:nsid w:val="56693B8C"/>
-    <w:multiLevelType w:val="multilevel"/>
-    <w:tmpl w:val="6298F0FA"/>
-    <w:lvl w:ilvl="0">
-      <w:start w:val="1"/>
-      <w:numFmt w:val="decimal"/>
-      <w:lvlText w:val="%1."/>
-      <w:lvlJc w:val="left"/>
-      <w:pPr>
-        <w:tabs>
-          <w:tab w:val="num" w:pos="720"/>
-        </w:tabs>
-        <w:ind w:left="720" w:hanging="360"/>
-      </w:pPr>
-    </w:lvl>
-    <w:lvl w:ilvl="1" w:tentative="1">
-      <w:start w:val="1"/>
-      <w:numFmt w:val="decimal"/>
-      <w:lvlText w:val="%2."/>
-      <w:lvlJc w:val="left"/>
-      <w:pPr>
-        <w:tabs>
-          <w:tab w:val="num" w:pos="1440"/>
-        </w:tabs>
-        <w:ind w:left="1440" w:hanging="360"/>
-      </w:pPr>
-    </w:lvl>
-    <w:lvl w:ilvl="2" w:tentative="1">
-      <w:start w:val="1"/>
-      <w:numFmt w:val="decimal"/>
-      <w:lvlText w:val="%3."/>
-      <w:lvlJc w:val="left"/>
-      <w:pPr>
-        <w:tabs>
-          <w:tab w:val="num" w:pos="2160"/>
-        </w:tabs>
-        <w:ind w:left="2160" w:hanging="360"/>
-      </w:pPr>
-    </w:lvl>
-    <w:lvl w:ilvl="3" w:tentative="1">
-      <w:start w:val="1"/>
-      <w:numFmt w:val="decimal"/>
-      <w:lvlText w:val="%4."/>
-      <w:lvlJc w:val="left"/>
-      <w:pPr>
-        <w:tabs>
-          <w:tab w:val="num" w:pos="2880"/>
-        </w:tabs>
-        <w:ind w:left="2880" w:hanging="360"/>
-      </w:pPr>
-    </w:lvl>
-    <w:lvl w:ilvl="4" w:tentative="1">
-      <w:start w:val="1"/>
-      <w:numFmt w:val="decimal"/>
-      <w:lvlText w:val="%5."/>
-      <w:lvlJc w:val="left"/>
-      <w:pPr>
-        <w:tabs>
-          <w:tab w:val="num" w:pos="3600"/>
-        </w:tabs>
-        <w:ind w:left="3600" w:hanging="360"/>
-      </w:pPr>
-    </w:lvl>
-    <w:lvl w:ilvl="5" w:tentative="1">
-      <w:start w:val="1"/>
-      <w:numFmt w:val="decimal"/>
-      <w:lvlText w:val="%6."/>
-      <w:lvlJc w:val="left"/>
-      <w:pPr>
-        <w:tabs>
-          <w:tab w:val="num" w:pos="4320"/>
-        </w:tabs>
-        <w:ind w:left="4320" w:hanging="360"/>
-      </w:pPr>
-    </w:lvl>
-    <w:lvl w:ilvl="6" w:tentative="1">
-      <w:start w:val="1"/>
-      <w:numFmt w:val="decimal"/>
-      <w:lvlText w:val="%7."/>
-      <w:lvlJc w:val="left"/>
-      <w:pPr>
-        <w:tabs>
-          <w:tab w:val="num" w:pos="5040"/>
-        </w:tabs>
-        <w:ind w:left="5040" w:hanging="360"/>
-      </w:pPr>
-    </w:lvl>
-    <w:lvl w:ilvl="7" w:tentative="1">
-      <w:start w:val="1"/>
-      <w:numFmt w:val="decimal"/>
-      <w:lvlText w:val="%8."/>
-      <w:lvlJc w:val="left"/>
-      <w:pPr>
-        <w:tabs>
-          <w:tab w:val="num" w:pos="5760"/>
-        </w:tabs>
-        <w:ind w:left="5760" w:hanging="360"/>
-      </w:pPr>
-    </w:lvl>
-    <w:lvl w:ilvl="8" w:tentative="1">
-      <w:start w:val="1"/>
-      <w:numFmt w:val="decimal"/>
-      <w:lvlText w:val="%9."/>
-      <w:lvlJc w:val="left"/>
-      <w:pPr>
-        <w:tabs>
-          <w:tab w:val="num" w:pos="6480"/>
-        </w:tabs>
-        <w:ind w:left="6480" w:hanging="360"/>
-      </w:pPr>
-    </w:lvl>
-  </w:abstractNum>
-  <w:abstractNum w:abstractNumId="8" w15:restartNumberingAfterBreak="0">
-    <w:nsid w:val="5F0B01A0"/>
-    <w:multiLevelType w:val="hybridMultilevel"/>
-    <w:tmpl w:val="237816F0"/>
-    <w:lvl w:ilvl="0" w:tplc="6EE827A6">
-      <w:start w:val="1"/>
-      <w:numFmt w:val="decimal"/>
-      <w:lvlText w:val="%1."/>
-      <w:lvlJc w:val="left"/>
-      <w:pPr>
-        <w:ind w:left="1083" w:hanging="636"/>
+        <w:ind w:left="1328" w:hanging="336"/>
       </w:pPr>
       <w:rPr>
         <w:rFonts w:ascii="Times New Roman" w:eastAsia="Times New Roman" w:hAnsi="Times New Roman" w:cs="Times New Roman" w:hint="default"/>
@@ -4696,107 +4717,415 @@
         <w:lang w:val="ru-RU" w:eastAsia="en-US" w:bidi="ar-SA"/>
       </w:rPr>
     </w:lvl>
-    <w:lvl w:ilvl="1" w:tplc="6CF4297C">
+    <w:lvl w:ilvl="1">
+      <w:start w:val="1"/>
+      <w:numFmt w:val="decimal"/>
+      <w:lvlText w:val="%1.%2."/>
+      <w:lvlJc w:val="left"/>
+      <w:pPr>
+        <w:ind w:left="1519" w:hanging="504"/>
+      </w:pPr>
+      <w:rPr>
+        <w:rFonts w:ascii="Times New Roman" w:eastAsia="Times New Roman" w:hAnsi="Times New Roman" w:cs="Times New Roman" w:hint="default"/>
+        <w:b/>
+        <w:bCs/>
+        <w:i w:val="0"/>
+        <w:iCs w:val="0"/>
+        <w:spacing w:val="0"/>
+        <w:w w:val="100"/>
+        <w:sz w:val="28"/>
+        <w:szCs w:val="28"/>
+        <w:lang w:val="ru-RU" w:eastAsia="en-US" w:bidi="ar-SA"/>
+      </w:rPr>
+    </w:lvl>
+    <w:lvl w:ilvl="2">
       <w:numFmt w:val="bullet"/>
       <w:lvlText w:val="•"/>
       <w:lvlJc w:val="left"/>
       <w:pPr>
-        <w:ind w:left="1893" w:hanging="636"/>
+        <w:ind w:left="2392" w:hanging="504"/>
       </w:pPr>
       <w:rPr>
         <w:rFonts w:hint="default"/>
         <w:lang w:val="ru-RU" w:eastAsia="en-US" w:bidi="ar-SA"/>
       </w:rPr>
     </w:lvl>
-    <w:lvl w:ilvl="2" w:tplc="D03E6B26">
+    <w:lvl w:ilvl="3">
       <w:numFmt w:val="bullet"/>
       <w:lvlText w:val="•"/>
       <w:lvlJc w:val="left"/>
       <w:pPr>
-        <w:ind w:left="2706" w:hanging="636"/>
+        <w:ind w:left="3262" w:hanging="504"/>
       </w:pPr>
       <w:rPr>
         <w:rFonts w:hint="default"/>
         <w:lang w:val="ru-RU" w:eastAsia="en-US" w:bidi="ar-SA"/>
       </w:rPr>
     </w:lvl>
-    <w:lvl w:ilvl="3" w:tplc="2B9C5B58">
+    <w:lvl w:ilvl="4">
       <w:numFmt w:val="bullet"/>
       <w:lvlText w:val="•"/>
       <w:lvlJc w:val="left"/>
       <w:pPr>
-        <w:ind w:left="3520" w:hanging="636"/>
+        <w:ind w:left="4133" w:hanging="504"/>
       </w:pPr>
       <w:rPr>
         <w:rFonts w:hint="default"/>
         <w:lang w:val="ru-RU" w:eastAsia="en-US" w:bidi="ar-SA"/>
       </w:rPr>
     </w:lvl>
-    <w:lvl w:ilvl="4" w:tplc="A042A018">
+    <w:lvl w:ilvl="5">
       <w:numFmt w:val="bullet"/>
       <w:lvlText w:val="•"/>
       <w:lvlJc w:val="left"/>
       <w:pPr>
-        <w:ind w:left="4333" w:hanging="636"/>
+        <w:ind w:left="5003" w:hanging="504"/>
       </w:pPr>
       <w:rPr>
         <w:rFonts w:hint="default"/>
         <w:lang w:val="ru-RU" w:eastAsia="en-US" w:bidi="ar-SA"/>
       </w:rPr>
     </w:lvl>
-    <w:lvl w:ilvl="5" w:tplc="1FFC4CC2">
+    <w:lvl w:ilvl="6">
       <w:numFmt w:val="bullet"/>
       <w:lvlText w:val="•"/>
       <w:lvlJc w:val="left"/>
       <w:pPr>
-        <w:ind w:left="5146" w:hanging="636"/>
+        <w:ind w:left="5873" w:hanging="504"/>
       </w:pPr>
       <w:rPr>
         <w:rFonts w:hint="default"/>
         <w:lang w:val="ru-RU" w:eastAsia="en-US" w:bidi="ar-SA"/>
       </w:rPr>
     </w:lvl>
-    <w:lvl w:ilvl="6" w:tplc="2C74BA1C">
+    <w:lvl w:ilvl="7">
       <w:numFmt w:val="bullet"/>
       <w:lvlText w:val="•"/>
       <w:lvlJc w:val="left"/>
       <w:pPr>
-        <w:ind w:left="5960" w:hanging="636"/>
+        <w:ind w:left="6744" w:hanging="504"/>
       </w:pPr>
       <w:rPr>
         <w:rFonts w:hint="default"/>
         <w:lang w:val="ru-RU" w:eastAsia="en-US" w:bidi="ar-SA"/>
       </w:rPr>
     </w:lvl>
-    <w:lvl w:ilvl="7" w:tplc="3234611A">
+    <w:lvl w:ilvl="8">
       <w:numFmt w:val="bullet"/>
       <w:lvlText w:val="•"/>
       <w:lvlJc w:val="left"/>
       <w:pPr>
-        <w:ind w:left="6773" w:hanging="636"/>
+        <w:ind w:left="7614" w:hanging="504"/>
       </w:pPr>
       <w:rPr>
         <w:rFonts w:hint="default"/>
         <w:lang w:val="ru-RU" w:eastAsia="en-US" w:bidi="ar-SA"/>
       </w:rPr>
     </w:lvl>
-    <w:lvl w:ilvl="8" w:tplc="9B4C2B46">
-      <w:numFmt w:val="bullet"/>
-      <w:lvlText w:val="•"/>
-      <w:lvlJc w:val="left"/>
-      <w:pPr>
-        <w:ind w:left="7586" w:hanging="636"/>
+  </w:abstractNum>
+  <w:abstractNum w:abstractNumId="5" w15:restartNumberingAfterBreak="0">
+    <w:nsid w:val="3FA71F67"/>
+    <w:multiLevelType w:val="hybridMultilevel"/>
+    <w:tmpl w:val="5B822446"/>
+    <w:lvl w:ilvl="0" w:tplc="63E6E15E">
+      <w:start w:val="1"/>
+      <w:numFmt w:val="decimal"/>
+      <w:lvlText w:val="%1."/>
+      <w:lvlJc w:val="left"/>
+      <w:pPr>
+        <w:ind w:left="1080" w:hanging="360"/>
       </w:pPr>
       <w:rPr>
         <w:rFonts w:hint="default"/>
-        <w:lang w:val="ru-RU" w:eastAsia="en-US" w:bidi="ar-SA"/>
       </w:rPr>
     </w:lvl>
+    <w:lvl w:ilvl="1" w:tplc="04190019" w:tentative="1">
+      <w:start w:val="1"/>
+      <w:numFmt w:val="lowerLetter"/>
+      <w:lvlText w:val="%2."/>
+      <w:lvlJc w:val="left"/>
+      <w:pPr>
+        <w:ind w:left="1800" w:hanging="360"/>
+      </w:pPr>
+    </w:lvl>
+    <w:lvl w:ilvl="2" w:tplc="0419001B" w:tentative="1">
+      <w:start w:val="1"/>
+      <w:numFmt w:val="lowerRoman"/>
+      <w:lvlText w:val="%3."/>
+      <w:lvlJc w:val="right"/>
+      <w:pPr>
+        <w:ind w:left="2520" w:hanging="180"/>
+      </w:pPr>
+    </w:lvl>
+    <w:lvl w:ilvl="3" w:tplc="0419000F" w:tentative="1">
+      <w:start w:val="1"/>
+      <w:numFmt w:val="decimal"/>
+      <w:lvlText w:val="%4."/>
+      <w:lvlJc w:val="left"/>
+      <w:pPr>
+        <w:ind w:left="3240" w:hanging="360"/>
+      </w:pPr>
+    </w:lvl>
+    <w:lvl w:ilvl="4" w:tplc="04190019" w:tentative="1">
+      <w:start w:val="1"/>
+      <w:numFmt w:val="lowerLetter"/>
+      <w:lvlText w:val="%5."/>
+      <w:lvlJc w:val="left"/>
+      <w:pPr>
+        <w:ind w:left="3960" w:hanging="360"/>
+      </w:pPr>
+    </w:lvl>
+    <w:lvl w:ilvl="5" w:tplc="0419001B" w:tentative="1">
+      <w:start w:val="1"/>
+      <w:numFmt w:val="lowerRoman"/>
+      <w:lvlText w:val="%6."/>
+      <w:lvlJc w:val="right"/>
+      <w:pPr>
+        <w:ind w:left="4680" w:hanging="180"/>
+      </w:pPr>
+    </w:lvl>
+    <w:lvl w:ilvl="6" w:tplc="0419000F" w:tentative="1">
+      <w:start w:val="1"/>
+      <w:numFmt w:val="decimal"/>
+      <w:lvlText w:val="%7."/>
+      <w:lvlJc w:val="left"/>
+      <w:pPr>
+        <w:ind w:left="5400" w:hanging="360"/>
+      </w:pPr>
+    </w:lvl>
+    <w:lvl w:ilvl="7" w:tplc="04190019" w:tentative="1">
+      <w:start w:val="1"/>
+      <w:numFmt w:val="lowerLetter"/>
+      <w:lvlText w:val="%8."/>
+      <w:lvlJc w:val="left"/>
+      <w:pPr>
+        <w:ind w:left="6120" w:hanging="360"/>
+      </w:pPr>
+    </w:lvl>
+    <w:lvl w:ilvl="8" w:tplc="0419001B" w:tentative="1">
+      <w:start w:val="1"/>
+      <w:numFmt w:val="lowerRoman"/>
+      <w:lvlText w:val="%9."/>
+      <w:lvlJc w:val="right"/>
+      <w:pPr>
+        <w:ind w:left="6840" w:hanging="180"/>
+      </w:pPr>
+    </w:lvl>
   </w:abstractNum>
-  <w:abstractNum w:abstractNumId="9" w15:restartNumberingAfterBreak="0">
-    <w:nsid w:val="67F2704D"/>
+  <w:abstractNum w:abstractNumId="6" w15:restartNumberingAfterBreak="0">
+    <w:nsid w:val="478A37B1"/>
     <w:multiLevelType w:val="multilevel"/>
-    <w:tmpl w:val="0AA00D78"/>
+    <w:tmpl w:val="A48048FC"/>
+    <w:lvl w:ilvl="0">
+      <w:start w:val="1"/>
+      <w:numFmt w:val="decimal"/>
+      <w:lvlText w:val="%1."/>
+      <w:lvlJc w:val="left"/>
+      <w:pPr>
+        <w:ind w:left="720" w:hanging="360"/>
+      </w:pPr>
+      <w:rPr>
+        <w:rFonts w:hint="default"/>
+      </w:rPr>
+    </w:lvl>
+    <w:lvl w:ilvl="1">
+      <w:start w:val="2"/>
+      <w:numFmt w:val="decimal"/>
+      <w:isLgl/>
+      <w:lvlText w:val="%1.%2."/>
+      <w:lvlJc w:val="left"/>
+      <w:pPr>
+        <w:ind w:left="1080" w:hanging="720"/>
+      </w:pPr>
+      <w:rPr>
+        <w:rFonts w:hint="default"/>
+      </w:rPr>
+    </w:lvl>
+    <w:lvl w:ilvl="2">
+      <w:start w:val="1"/>
+      <w:numFmt w:val="decimal"/>
+      <w:isLgl/>
+      <w:lvlText w:val="%1.%2.%3."/>
+      <w:lvlJc w:val="left"/>
+      <w:pPr>
+        <w:ind w:left="1080" w:hanging="720"/>
+      </w:pPr>
+      <w:rPr>
+        <w:rFonts w:hint="default"/>
+      </w:rPr>
+    </w:lvl>
+    <w:lvl w:ilvl="3">
+      <w:start w:val="1"/>
+      <w:numFmt w:val="decimal"/>
+      <w:isLgl/>
+      <w:lvlText w:val="%1.%2.%3.%4."/>
+      <w:lvlJc w:val="left"/>
+      <w:pPr>
+        <w:ind w:left="1440" w:hanging="1080"/>
+      </w:pPr>
+      <w:rPr>
+        <w:rFonts w:hint="default"/>
+      </w:rPr>
+    </w:lvl>
+    <w:lvl w:ilvl="4">
+      <w:start w:val="1"/>
+      <w:numFmt w:val="decimal"/>
+      <w:isLgl/>
+      <w:lvlText w:val="%1.%2.%3.%4.%5."/>
+      <w:lvlJc w:val="left"/>
+      <w:pPr>
+        <w:ind w:left="1440" w:hanging="1080"/>
+      </w:pPr>
+      <w:rPr>
+        <w:rFonts w:hint="default"/>
+      </w:rPr>
+    </w:lvl>
+    <w:lvl w:ilvl="5">
+      <w:start w:val="1"/>
+      <w:numFmt w:val="decimal"/>
+      <w:isLgl/>
+      <w:lvlText w:val="%1.%2.%3.%4.%5.%6."/>
+      <w:lvlJc w:val="left"/>
+      <w:pPr>
+        <w:ind w:left="1800" w:hanging="1440"/>
+      </w:pPr>
+      <w:rPr>
+        <w:rFonts w:hint="default"/>
+      </w:rPr>
+    </w:lvl>
+    <w:lvl w:ilvl="6">
+      <w:start w:val="1"/>
+      <w:numFmt w:val="decimal"/>
+      <w:isLgl/>
+      <w:lvlText w:val="%1.%2.%3.%4.%5.%6.%7."/>
+      <w:lvlJc w:val="left"/>
+      <w:pPr>
+        <w:ind w:left="2160" w:hanging="1800"/>
+      </w:pPr>
+      <w:rPr>
+        <w:rFonts w:hint="default"/>
+      </w:rPr>
+    </w:lvl>
+    <w:lvl w:ilvl="7">
+      <w:start w:val="1"/>
+      <w:numFmt w:val="decimal"/>
+      <w:isLgl/>
+      <w:lvlText w:val="%1.%2.%3.%4.%5.%6.%7.%8."/>
+      <w:lvlJc w:val="left"/>
+      <w:pPr>
+        <w:ind w:left="2160" w:hanging="1800"/>
+      </w:pPr>
+      <w:rPr>
+        <w:rFonts w:hint="default"/>
+      </w:rPr>
+    </w:lvl>
+    <w:lvl w:ilvl="8">
+      <w:start w:val="1"/>
+      <w:numFmt w:val="decimal"/>
+      <w:isLgl/>
+      <w:lvlText w:val="%1.%2.%3.%4.%5.%6.%7.%8.%9."/>
+      <w:lvlJc w:val="left"/>
+      <w:pPr>
+        <w:ind w:left="2520" w:hanging="2160"/>
+      </w:pPr>
+      <w:rPr>
+        <w:rFonts w:hint="default"/>
+      </w:rPr>
+    </w:lvl>
+  </w:abstractNum>
+  <w:abstractNum w:abstractNumId="7" w15:restartNumberingAfterBreak="0">
+    <w:nsid w:val="4E060336"/>
+    <w:multiLevelType w:val="hybridMultilevel"/>
+    <w:tmpl w:val="40DA588C"/>
+    <w:lvl w:ilvl="0" w:tplc="0419000F">
+      <w:start w:val="1"/>
+      <w:numFmt w:val="decimal"/>
+      <w:lvlText w:val="%1."/>
+      <w:lvlJc w:val="left"/>
+      <w:pPr>
+        <w:ind w:left="720" w:hanging="360"/>
+      </w:pPr>
+      <w:rPr>
+        <w:rFonts w:hint="default"/>
+      </w:rPr>
+    </w:lvl>
+    <w:lvl w:ilvl="1" w:tplc="04190019" w:tentative="1">
+      <w:start w:val="1"/>
+      <w:numFmt w:val="lowerLetter"/>
+      <w:lvlText w:val="%2."/>
+      <w:lvlJc w:val="left"/>
+      <w:pPr>
+        <w:ind w:left="1440" w:hanging="360"/>
+      </w:pPr>
+    </w:lvl>
+    <w:lvl w:ilvl="2" w:tplc="0419001B" w:tentative="1">
+      <w:start w:val="1"/>
+      <w:numFmt w:val="lowerRoman"/>
+      <w:lvlText w:val="%3."/>
+      <w:lvlJc w:val="right"/>
+      <w:pPr>
+        <w:ind w:left="2160" w:hanging="180"/>
+      </w:pPr>
+    </w:lvl>
+    <w:lvl w:ilvl="3" w:tplc="0419000F" w:tentative="1">
+      <w:start w:val="1"/>
+      <w:numFmt w:val="decimal"/>
+      <w:lvlText w:val="%4."/>
+      <w:lvlJc w:val="left"/>
+      <w:pPr>
+        <w:ind w:left="2880" w:hanging="360"/>
+      </w:pPr>
+    </w:lvl>
+    <w:lvl w:ilvl="4" w:tplc="04190019" w:tentative="1">
+      <w:start w:val="1"/>
+      <w:numFmt w:val="lowerLetter"/>
+      <w:lvlText w:val="%5."/>
+      <w:lvlJc w:val="left"/>
+      <w:pPr>
+        <w:ind w:left="3600" w:hanging="360"/>
+      </w:pPr>
+    </w:lvl>
+    <w:lvl w:ilvl="5" w:tplc="0419001B" w:tentative="1">
+      <w:start w:val="1"/>
+      <w:numFmt w:val="lowerRoman"/>
+      <w:lvlText w:val="%6."/>
+      <w:lvlJc w:val="right"/>
+      <w:pPr>
+        <w:ind w:left="4320" w:hanging="180"/>
+      </w:pPr>
+    </w:lvl>
+    <w:lvl w:ilvl="6" w:tplc="0419000F" w:tentative="1">
+      <w:start w:val="1"/>
+      <w:numFmt w:val="decimal"/>
+      <w:lvlText w:val="%7."/>
+      <w:lvlJc w:val="left"/>
+      <w:pPr>
+        <w:ind w:left="5040" w:hanging="360"/>
+      </w:pPr>
+    </w:lvl>
+    <w:lvl w:ilvl="7" w:tplc="04190019" w:tentative="1">
+      <w:start w:val="1"/>
+      <w:numFmt w:val="lowerLetter"/>
+      <w:lvlText w:val="%8."/>
+      <w:lvlJc w:val="left"/>
+      <w:pPr>
+        <w:ind w:left="5760" w:hanging="360"/>
+      </w:pPr>
+    </w:lvl>
+    <w:lvl w:ilvl="8" w:tplc="0419001B" w:tentative="1">
+      <w:start w:val="1"/>
+      <w:numFmt w:val="lowerRoman"/>
+      <w:lvlText w:val="%9."/>
+      <w:lvlJc w:val="right"/>
+      <w:pPr>
+        <w:ind w:left="6480" w:hanging="180"/>
+      </w:pPr>
+    </w:lvl>
+  </w:abstractNum>
+  <w:abstractNum w:abstractNumId="8" w15:restartNumberingAfterBreak="0">
+    <w:nsid w:val="56693B8C"/>
+    <w:multiLevelType w:val="multilevel"/>
+    <w:tmpl w:val="6298F0FA"/>
     <w:lvl w:ilvl="0">
       <w:start w:val="1"/>
       <w:numFmt w:val="decimal"/>
@@ -4906,195 +5235,17 @@
       </w:pPr>
     </w:lvl>
   </w:abstractNum>
-  <w:abstractNum w:abstractNumId="10" w15:restartNumberingAfterBreak="0">
-    <w:nsid w:val="693E5040"/>
+  <w:abstractNum w:abstractNumId="9" w15:restartNumberingAfterBreak="0">
+    <w:nsid w:val="5F0B01A0"/>
     <w:multiLevelType w:val="hybridMultilevel"/>
-    <w:tmpl w:val="74A2CCC8"/>
-    <w:lvl w:ilvl="0" w:tplc="0419000F">
+    <w:tmpl w:val="237816F0"/>
+    <w:lvl w:ilvl="0" w:tplc="6EE827A6">
       <w:start w:val="1"/>
       <w:numFmt w:val="decimal"/>
       <w:lvlText w:val="%1."/>
       <w:lvlJc w:val="left"/>
       <w:pPr>
-        <w:ind w:left="720" w:hanging="360"/>
-      </w:pPr>
-      <w:rPr>
-        <w:rFonts w:hint="default"/>
-      </w:rPr>
-    </w:lvl>
-    <w:lvl w:ilvl="1" w:tplc="04190019" w:tentative="1">
-      <w:start w:val="1"/>
-      <w:numFmt w:val="lowerLetter"/>
-      <w:lvlText w:val="%2."/>
-      <w:lvlJc w:val="left"/>
-      <w:pPr>
-        <w:ind w:left="1440" w:hanging="360"/>
-      </w:pPr>
-    </w:lvl>
-    <w:lvl w:ilvl="2" w:tplc="0419001B" w:tentative="1">
-      <w:start w:val="1"/>
-      <w:numFmt w:val="lowerRoman"/>
-      <w:lvlText w:val="%3."/>
-      <w:lvlJc w:val="right"/>
-      <w:pPr>
-        <w:ind w:left="2160" w:hanging="180"/>
-      </w:pPr>
-    </w:lvl>
-    <w:lvl w:ilvl="3" w:tplc="0419000F" w:tentative="1">
-      <w:start w:val="1"/>
-      <w:numFmt w:val="decimal"/>
-      <w:lvlText w:val="%4."/>
-      <w:lvlJc w:val="left"/>
-      <w:pPr>
-        <w:ind w:left="2880" w:hanging="360"/>
-      </w:pPr>
-    </w:lvl>
-    <w:lvl w:ilvl="4" w:tplc="04190019" w:tentative="1">
-      <w:start w:val="1"/>
-      <w:numFmt w:val="lowerLetter"/>
-      <w:lvlText w:val="%5."/>
-      <w:lvlJc w:val="left"/>
-      <w:pPr>
-        <w:ind w:left="3600" w:hanging="360"/>
-      </w:pPr>
-    </w:lvl>
-    <w:lvl w:ilvl="5" w:tplc="0419001B" w:tentative="1">
-      <w:start w:val="1"/>
-      <w:numFmt w:val="lowerRoman"/>
-      <w:lvlText w:val="%6."/>
-      <w:lvlJc w:val="right"/>
-      <w:pPr>
-        <w:ind w:left="4320" w:hanging="180"/>
-      </w:pPr>
-    </w:lvl>
-    <w:lvl w:ilvl="6" w:tplc="0419000F" w:tentative="1">
-      <w:start w:val="1"/>
-      <w:numFmt w:val="decimal"/>
-      <w:lvlText w:val="%7."/>
-      <w:lvlJc w:val="left"/>
-      <w:pPr>
-        <w:ind w:left="5040" w:hanging="360"/>
-      </w:pPr>
-    </w:lvl>
-    <w:lvl w:ilvl="7" w:tplc="04190019" w:tentative="1">
-      <w:start w:val="1"/>
-      <w:numFmt w:val="lowerLetter"/>
-      <w:lvlText w:val="%8."/>
-      <w:lvlJc w:val="left"/>
-      <w:pPr>
-        <w:ind w:left="5760" w:hanging="360"/>
-      </w:pPr>
-    </w:lvl>
-    <w:lvl w:ilvl="8" w:tplc="0419001B" w:tentative="1">
-      <w:start w:val="1"/>
-      <w:numFmt w:val="lowerRoman"/>
-      <w:lvlText w:val="%9."/>
-      <w:lvlJc w:val="right"/>
-      <w:pPr>
-        <w:ind w:left="6480" w:hanging="180"/>
-      </w:pPr>
-    </w:lvl>
-  </w:abstractNum>
-  <w:abstractNum w:abstractNumId="11" w15:restartNumberingAfterBreak="0">
-    <w:nsid w:val="74DF503E"/>
-    <w:multiLevelType w:val="hybridMultilevel"/>
-    <w:tmpl w:val="A3929A88"/>
-    <w:lvl w:ilvl="0" w:tplc="0419000F">
-      <w:start w:val="1"/>
-      <w:numFmt w:val="decimal"/>
-      <w:lvlText w:val="%1."/>
-      <w:lvlJc w:val="left"/>
-      <w:pPr>
-        <w:ind w:left="720" w:hanging="360"/>
-      </w:pPr>
-      <w:rPr>
-        <w:rFonts w:hint="default"/>
-      </w:rPr>
-    </w:lvl>
-    <w:lvl w:ilvl="1" w:tplc="04190019" w:tentative="1">
-      <w:start w:val="1"/>
-      <w:numFmt w:val="lowerLetter"/>
-      <w:lvlText w:val="%2."/>
-      <w:lvlJc w:val="left"/>
-      <w:pPr>
-        <w:ind w:left="1440" w:hanging="360"/>
-      </w:pPr>
-    </w:lvl>
-    <w:lvl w:ilvl="2" w:tplc="0419001B" w:tentative="1">
-      <w:start w:val="1"/>
-      <w:numFmt w:val="lowerRoman"/>
-      <w:lvlText w:val="%3."/>
-      <w:lvlJc w:val="right"/>
-      <w:pPr>
-        <w:ind w:left="2160" w:hanging="180"/>
-      </w:pPr>
-    </w:lvl>
-    <w:lvl w:ilvl="3" w:tplc="0419000F" w:tentative="1">
-      <w:start w:val="1"/>
-      <w:numFmt w:val="decimal"/>
-      <w:lvlText w:val="%4."/>
-      <w:lvlJc w:val="left"/>
-      <w:pPr>
-        <w:ind w:left="2880" w:hanging="360"/>
-      </w:pPr>
-    </w:lvl>
-    <w:lvl w:ilvl="4" w:tplc="04190019" w:tentative="1">
-      <w:start w:val="1"/>
-      <w:numFmt w:val="lowerLetter"/>
-      <w:lvlText w:val="%5."/>
-      <w:lvlJc w:val="left"/>
-      <w:pPr>
-        <w:ind w:left="3600" w:hanging="360"/>
-      </w:pPr>
-    </w:lvl>
-    <w:lvl w:ilvl="5" w:tplc="0419001B" w:tentative="1">
-      <w:start w:val="1"/>
-      <w:numFmt w:val="lowerRoman"/>
-      <w:lvlText w:val="%6."/>
-      <w:lvlJc w:val="right"/>
-      <w:pPr>
-        <w:ind w:left="4320" w:hanging="180"/>
-      </w:pPr>
-    </w:lvl>
-    <w:lvl w:ilvl="6" w:tplc="0419000F" w:tentative="1">
-      <w:start w:val="1"/>
-      <w:numFmt w:val="decimal"/>
-      <w:lvlText w:val="%7."/>
-      <w:lvlJc w:val="left"/>
-      <w:pPr>
-        <w:ind w:left="5040" w:hanging="360"/>
-      </w:pPr>
-    </w:lvl>
-    <w:lvl w:ilvl="7" w:tplc="04190019" w:tentative="1">
-      <w:start w:val="1"/>
-      <w:numFmt w:val="lowerLetter"/>
-      <w:lvlText w:val="%8."/>
-      <w:lvlJc w:val="left"/>
-      <w:pPr>
-        <w:ind w:left="5760" w:hanging="360"/>
-      </w:pPr>
-    </w:lvl>
-    <w:lvl w:ilvl="8" w:tplc="0419001B" w:tentative="1">
-      <w:start w:val="1"/>
-      <w:numFmt w:val="lowerRoman"/>
-      <w:lvlText w:val="%9."/>
-      <w:lvlJc w:val="right"/>
-      <w:pPr>
-        <w:ind w:left="6480" w:hanging="180"/>
-      </w:pPr>
-    </w:lvl>
-  </w:abstractNum>
-  <w:abstractNum w:abstractNumId="12" w15:restartNumberingAfterBreak="0">
-    <w:nsid w:val="75F6363D"/>
-    <w:multiLevelType w:val="multilevel"/>
-    <w:tmpl w:val="98A8DE28"/>
-    <w:lvl w:ilvl="0">
-      <w:start w:val="1"/>
-      <w:numFmt w:val="decimal"/>
-      <w:lvlText w:val="%1."/>
-      <w:lvlJc w:val="left"/>
-      <w:pPr>
-        <w:ind w:left="1209" w:hanging="336"/>
+        <w:ind w:left="1083" w:hanging="636"/>
       </w:pPr>
       <w:rPr>
         <w:rFonts w:ascii="Times New Roman" w:eastAsia="Times New Roman" w:hAnsi="Times New Roman" w:cs="Times New Roman" w:hint="default"/>
@@ -5109,6 +5260,419 @@
         <w:lang w:val="ru-RU" w:eastAsia="en-US" w:bidi="ar-SA"/>
       </w:rPr>
     </w:lvl>
+    <w:lvl w:ilvl="1" w:tplc="6CF4297C">
+      <w:numFmt w:val="bullet"/>
+      <w:lvlText w:val="•"/>
+      <w:lvlJc w:val="left"/>
+      <w:pPr>
+        <w:ind w:left="1893" w:hanging="636"/>
+      </w:pPr>
+      <w:rPr>
+        <w:rFonts w:hint="default"/>
+        <w:lang w:val="ru-RU" w:eastAsia="en-US" w:bidi="ar-SA"/>
+      </w:rPr>
+    </w:lvl>
+    <w:lvl w:ilvl="2" w:tplc="D03E6B26">
+      <w:numFmt w:val="bullet"/>
+      <w:lvlText w:val="•"/>
+      <w:lvlJc w:val="left"/>
+      <w:pPr>
+        <w:ind w:left="2706" w:hanging="636"/>
+      </w:pPr>
+      <w:rPr>
+        <w:rFonts w:hint="default"/>
+        <w:lang w:val="ru-RU" w:eastAsia="en-US" w:bidi="ar-SA"/>
+      </w:rPr>
+    </w:lvl>
+    <w:lvl w:ilvl="3" w:tplc="2B9C5B58">
+      <w:numFmt w:val="bullet"/>
+      <w:lvlText w:val="•"/>
+      <w:lvlJc w:val="left"/>
+      <w:pPr>
+        <w:ind w:left="3520" w:hanging="636"/>
+      </w:pPr>
+      <w:rPr>
+        <w:rFonts w:hint="default"/>
+        <w:lang w:val="ru-RU" w:eastAsia="en-US" w:bidi="ar-SA"/>
+      </w:rPr>
+    </w:lvl>
+    <w:lvl w:ilvl="4" w:tplc="A042A018">
+      <w:numFmt w:val="bullet"/>
+      <w:lvlText w:val="•"/>
+      <w:lvlJc w:val="left"/>
+      <w:pPr>
+        <w:ind w:left="4333" w:hanging="636"/>
+      </w:pPr>
+      <w:rPr>
+        <w:rFonts w:hint="default"/>
+        <w:lang w:val="ru-RU" w:eastAsia="en-US" w:bidi="ar-SA"/>
+      </w:rPr>
+    </w:lvl>
+    <w:lvl w:ilvl="5" w:tplc="1FFC4CC2">
+      <w:numFmt w:val="bullet"/>
+      <w:lvlText w:val="•"/>
+      <w:lvlJc w:val="left"/>
+      <w:pPr>
+        <w:ind w:left="5146" w:hanging="636"/>
+      </w:pPr>
+      <w:rPr>
+        <w:rFonts w:hint="default"/>
+        <w:lang w:val="ru-RU" w:eastAsia="en-US" w:bidi="ar-SA"/>
+      </w:rPr>
+    </w:lvl>
+    <w:lvl w:ilvl="6" w:tplc="2C74BA1C">
+      <w:numFmt w:val="bullet"/>
+      <w:lvlText w:val="•"/>
+      <w:lvlJc w:val="left"/>
+      <w:pPr>
+        <w:ind w:left="5960" w:hanging="636"/>
+      </w:pPr>
+      <w:rPr>
+        <w:rFonts w:hint="default"/>
+        <w:lang w:val="ru-RU" w:eastAsia="en-US" w:bidi="ar-SA"/>
+      </w:rPr>
+    </w:lvl>
+    <w:lvl w:ilvl="7" w:tplc="3234611A">
+      <w:numFmt w:val="bullet"/>
+      <w:lvlText w:val="•"/>
+      <w:lvlJc w:val="left"/>
+      <w:pPr>
+        <w:ind w:left="6773" w:hanging="636"/>
+      </w:pPr>
+      <w:rPr>
+        <w:rFonts w:hint="default"/>
+        <w:lang w:val="ru-RU" w:eastAsia="en-US" w:bidi="ar-SA"/>
+      </w:rPr>
+    </w:lvl>
+    <w:lvl w:ilvl="8" w:tplc="9B4C2B46">
+      <w:numFmt w:val="bullet"/>
+      <w:lvlText w:val="•"/>
+      <w:lvlJc w:val="left"/>
+      <w:pPr>
+        <w:ind w:left="7586" w:hanging="636"/>
+      </w:pPr>
+      <w:rPr>
+        <w:rFonts w:hint="default"/>
+        <w:lang w:val="ru-RU" w:eastAsia="en-US" w:bidi="ar-SA"/>
+      </w:rPr>
+    </w:lvl>
+  </w:abstractNum>
+  <w:abstractNum w:abstractNumId="10" w15:restartNumberingAfterBreak="0">
+    <w:nsid w:val="67F2704D"/>
+    <w:multiLevelType w:val="multilevel"/>
+    <w:tmpl w:val="0AA00D78"/>
+    <w:lvl w:ilvl="0">
+      <w:start w:val="1"/>
+      <w:numFmt w:val="decimal"/>
+      <w:lvlText w:val="%1."/>
+      <w:lvlJc w:val="left"/>
+      <w:pPr>
+        <w:tabs>
+          <w:tab w:val="num" w:pos="720"/>
+        </w:tabs>
+        <w:ind w:left="720" w:hanging="360"/>
+      </w:pPr>
+    </w:lvl>
+    <w:lvl w:ilvl="1" w:tentative="1">
+      <w:start w:val="1"/>
+      <w:numFmt w:val="decimal"/>
+      <w:lvlText w:val="%2."/>
+      <w:lvlJc w:val="left"/>
+      <w:pPr>
+        <w:tabs>
+          <w:tab w:val="num" w:pos="1440"/>
+        </w:tabs>
+        <w:ind w:left="1440" w:hanging="360"/>
+      </w:pPr>
+    </w:lvl>
+    <w:lvl w:ilvl="2" w:tentative="1">
+      <w:start w:val="1"/>
+      <w:numFmt w:val="decimal"/>
+      <w:lvlText w:val="%3."/>
+      <w:lvlJc w:val="left"/>
+      <w:pPr>
+        <w:tabs>
+          <w:tab w:val="num" w:pos="2160"/>
+        </w:tabs>
+        <w:ind w:left="2160" w:hanging="360"/>
+      </w:pPr>
+    </w:lvl>
+    <w:lvl w:ilvl="3" w:tentative="1">
+      <w:start w:val="1"/>
+      <w:numFmt w:val="decimal"/>
+      <w:lvlText w:val="%4."/>
+      <w:lvlJc w:val="left"/>
+      <w:pPr>
+        <w:tabs>
+          <w:tab w:val="num" w:pos="2880"/>
+        </w:tabs>
+        <w:ind w:left="2880" w:hanging="360"/>
+      </w:pPr>
+    </w:lvl>
+    <w:lvl w:ilvl="4" w:tentative="1">
+      <w:start w:val="1"/>
+      <w:numFmt w:val="decimal"/>
+      <w:lvlText w:val="%5."/>
+      <w:lvlJc w:val="left"/>
+      <w:pPr>
+        <w:tabs>
+          <w:tab w:val="num" w:pos="3600"/>
+        </w:tabs>
+        <w:ind w:left="3600" w:hanging="360"/>
+      </w:pPr>
+    </w:lvl>
+    <w:lvl w:ilvl="5" w:tentative="1">
+      <w:start w:val="1"/>
+      <w:numFmt w:val="decimal"/>
+      <w:lvlText w:val="%6."/>
+      <w:lvlJc w:val="left"/>
+      <w:pPr>
+        <w:tabs>
+          <w:tab w:val="num" w:pos="4320"/>
+        </w:tabs>
+        <w:ind w:left="4320" w:hanging="360"/>
+      </w:pPr>
+    </w:lvl>
+    <w:lvl w:ilvl="6" w:tentative="1">
+      <w:start w:val="1"/>
+      <w:numFmt w:val="decimal"/>
+      <w:lvlText w:val="%7."/>
+      <w:lvlJc w:val="left"/>
+      <w:pPr>
+        <w:tabs>
+          <w:tab w:val="num" w:pos="5040"/>
+        </w:tabs>
+        <w:ind w:left="5040" w:hanging="360"/>
+      </w:pPr>
+    </w:lvl>
+    <w:lvl w:ilvl="7" w:tentative="1">
+      <w:start w:val="1"/>
+      <w:numFmt w:val="decimal"/>
+      <w:lvlText w:val="%8."/>
+      <w:lvlJc w:val="left"/>
+      <w:pPr>
+        <w:tabs>
+          <w:tab w:val="num" w:pos="5760"/>
+        </w:tabs>
+        <w:ind w:left="5760" w:hanging="360"/>
+      </w:pPr>
+    </w:lvl>
+    <w:lvl w:ilvl="8" w:tentative="1">
+      <w:start w:val="1"/>
+      <w:numFmt w:val="decimal"/>
+      <w:lvlText w:val="%9."/>
+      <w:lvlJc w:val="left"/>
+      <w:pPr>
+        <w:tabs>
+          <w:tab w:val="num" w:pos="6480"/>
+        </w:tabs>
+        <w:ind w:left="6480" w:hanging="360"/>
+      </w:pPr>
+    </w:lvl>
+  </w:abstractNum>
+  <w:abstractNum w:abstractNumId="11" w15:restartNumberingAfterBreak="0">
+    <w:nsid w:val="693E5040"/>
+    <w:multiLevelType w:val="hybridMultilevel"/>
+    <w:tmpl w:val="74A2CCC8"/>
+    <w:lvl w:ilvl="0" w:tplc="0419000F">
+      <w:start w:val="1"/>
+      <w:numFmt w:val="decimal"/>
+      <w:lvlText w:val="%1."/>
+      <w:lvlJc w:val="left"/>
+      <w:pPr>
+        <w:ind w:left="720" w:hanging="360"/>
+      </w:pPr>
+      <w:rPr>
+        <w:rFonts w:hint="default"/>
+      </w:rPr>
+    </w:lvl>
+    <w:lvl w:ilvl="1" w:tplc="04190019" w:tentative="1">
+      <w:start w:val="1"/>
+      <w:numFmt w:val="lowerLetter"/>
+      <w:lvlText w:val="%2."/>
+      <w:lvlJc w:val="left"/>
+      <w:pPr>
+        <w:ind w:left="1440" w:hanging="360"/>
+      </w:pPr>
+    </w:lvl>
+    <w:lvl w:ilvl="2" w:tplc="0419001B" w:tentative="1">
+      <w:start w:val="1"/>
+      <w:numFmt w:val="lowerRoman"/>
+      <w:lvlText w:val="%3."/>
+      <w:lvlJc w:val="right"/>
+      <w:pPr>
+        <w:ind w:left="2160" w:hanging="180"/>
+      </w:pPr>
+    </w:lvl>
+    <w:lvl w:ilvl="3" w:tplc="0419000F" w:tentative="1">
+      <w:start w:val="1"/>
+      <w:numFmt w:val="decimal"/>
+      <w:lvlText w:val="%4."/>
+      <w:lvlJc w:val="left"/>
+      <w:pPr>
+        <w:ind w:left="2880" w:hanging="360"/>
+      </w:pPr>
+    </w:lvl>
+    <w:lvl w:ilvl="4" w:tplc="04190019" w:tentative="1">
+      <w:start w:val="1"/>
+      <w:numFmt w:val="lowerLetter"/>
+      <w:lvlText w:val="%5."/>
+      <w:lvlJc w:val="left"/>
+      <w:pPr>
+        <w:ind w:left="3600" w:hanging="360"/>
+      </w:pPr>
+    </w:lvl>
+    <w:lvl w:ilvl="5" w:tplc="0419001B" w:tentative="1">
+      <w:start w:val="1"/>
+      <w:numFmt w:val="lowerRoman"/>
+      <w:lvlText w:val="%6."/>
+      <w:lvlJc w:val="right"/>
+      <w:pPr>
+        <w:ind w:left="4320" w:hanging="180"/>
+      </w:pPr>
+    </w:lvl>
+    <w:lvl w:ilvl="6" w:tplc="0419000F" w:tentative="1">
+      <w:start w:val="1"/>
+      <w:numFmt w:val="decimal"/>
+      <w:lvlText w:val="%7."/>
+      <w:lvlJc w:val="left"/>
+      <w:pPr>
+        <w:ind w:left="5040" w:hanging="360"/>
+      </w:pPr>
+    </w:lvl>
+    <w:lvl w:ilvl="7" w:tplc="04190019" w:tentative="1">
+      <w:start w:val="1"/>
+      <w:numFmt w:val="lowerLetter"/>
+      <w:lvlText w:val="%8."/>
+      <w:lvlJc w:val="left"/>
+      <w:pPr>
+        <w:ind w:left="5760" w:hanging="360"/>
+      </w:pPr>
+    </w:lvl>
+    <w:lvl w:ilvl="8" w:tplc="0419001B" w:tentative="1">
+      <w:start w:val="1"/>
+      <w:numFmt w:val="lowerRoman"/>
+      <w:lvlText w:val="%9."/>
+      <w:lvlJc w:val="right"/>
+      <w:pPr>
+        <w:ind w:left="6480" w:hanging="180"/>
+      </w:pPr>
+    </w:lvl>
+  </w:abstractNum>
+  <w:abstractNum w:abstractNumId="12" w15:restartNumberingAfterBreak="0">
+    <w:nsid w:val="74DF503E"/>
+    <w:multiLevelType w:val="hybridMultilevel"/>
+    <w:tmpl w:val="A3929A88"/>
+    <w:lvl w:ilvl="0" w:tplc="0419000F">
+      <w:start w:val="1"/>
+      <w:numFmt w:val="decimal"/>
+      <w:lvlText w:val="%1."/>
+      <w:lvlJc w:val="left"/>
+      <w:pPr>
+        <w:ind w:left="720" w:hanging="360"/>
+      </w:pPr>
+      <w:rPr>
+        <w:rFonts w:hint="default"/>
+      </w:rPr>
+    </w:lvl>
+    <w:lvl w:ilvl="1" w:tplc="04190019" w:tentative="1">
+      <w:start w:val="1"/>
+      <w:numFmt w:val="lowerLetter"/>
+      <w:lvlText w:val="%2."/>
+      <w:lvlJc w:val="left"/>
+      <w:pPr>
+        <w:ind w:left="1440" w:hanging="360"/>
+      </w:pPr>
+    </w:lvl>
+    <w:lvl w:ilvl="2" w:tplc="0419001B" w:tentative="1">
+      <w:start w:val="1"/>
+      <w:numFmt w:val="lowerRoman"/>
+      <w:lvlText w:val="%3."/>
+      <w:lvlJc w:val="right"/>
+      <w:pPr>
+        <w:ind w:left="2160" w:hanging="180"/>
+      </w:pPr>
+    </w:lvl>
+    <w:lvl w:ilvl="3" w:tplc="0419000F" w:tentative="1">
+      <w:start w:val="1"/>
+      <w:numFmt w:val="decimal"/>
+      <w:lvlText w:val="%4."/>
+      <w:lvlJc w:val="left"/>
+      <w:pPr>
+        <w:ind w:left="2880" w:hanging="360"/>
+      </w:pPr>
+    </w:lvl>
+    <w:lvl w:ilvl="4" w:tplc="04190019" w:tentative="1">
+      <w:start w:val="1"/>
+      <w:numFmt w:val="lowerLetter"/>
+      <w:lvlText w:val="%5."/>
+      <w:lvlJc w:val="left"/>
+      <w:pPr>
+        <w:ind w:left="3600" w:hanging="360"/>
+      </w:pPr>
+    </w:lvl>
+    <w:lvl w:ilvl="5" w:tplc="0419001B" w:tentative="1">
+      <w:start w:val="1"/>
+      <w:numFmt w:val="lowerRoman"/>
+      <w:lvlText w:val="%6."/>
+      <w:lvlJc w:val="right"/>
+      <w:pPr>
+        <w:ind w:left="4320" w:hanging="180"/>
+      </w:pPr>
+    </w:lvl>
+    <w:lvl w:ilvl="6" w:tplc="0419000F" w:tentative="1">
+      <w:start w:val="1"/>
+      <w:numFmt w:val="decimal"/>
+      <w:lvlText w:val="%7."/>
+      <w:lvlJc w:val="left"/>
+      <w:pPr>
+        <w:ind w:left="5040" w:hanging="360"/>
+      </w:pPr>
+    </w:lvl>
+    <w:lvl w:ilvl="7" w:tplc="04190019" w:tentative="1">
+      <w:start w:val="1"/>
+      <w:numFmt w:val="lowerLetter"/>
+      <w:lvlText w:val="%8."/>
+      <w:lvlJc w:val="left"/>
+      <w:pPr>
+        <w:ind w:left="5760" w:hanging="360"/>
+      </w:pPr>
+    </w:lvl>
+    <w:lvl w:ilvl="8" w:tplc="0419001B" w:tentative="1">
+      <w:start w:val="1"/>
+      <w:numFmt w:val="lowerRoman"/>
+      <w:lvlText w:val="%9."/>
+      <w:lvlJc w:val="right"/>
+      <w:pPr>
+        <w:ind w:left="6480" w:hanging="180"/>
+      </w:pPr>
+    </w:lvl>
+  </w:abstractNum>
+  <w:abstractNum w:abstractNumId="13" w15:restartNumberingAfterBreak="0">
+    <w:nsid w:val="75F6363D"/>
+    <w:multiLevelType w:val="multilevel"/>
+    <w:tmpl w:val="98A8DE28"/>
+    <w:lvl w:ilvl="0">
+      <w:start w:val="1"/>
+      <w:numFmt w:val="decimal"/>
+      <w:lvlText w:val="%1."/>
+      <w:lvlJc w:val="left"/>
+      <w:pPr>
+        <w:ind w:left="1209" w:hanging="336"/>
+      </w:pPr>
+      <w:rPr>
+        <w:rFonts w:ascii="Times New Roman" w:eastAsia="Times New Roman" w:hAnsi="Times New Roman" w:cs="Times New Roman" w:hint="default"/>
+        <w:b w:val="0"/>
+        <w:bCs w:val="0"/>
+        <w:i w:val="0"/>
+        <w:iCs w:val="0"/>
+        <w:spacing w:val="0"/>
+        <w:w w:val="100"/>
+        <w:sz w:val="28"/>
+        <w:szCs w:val="28"/>
+        <w:lang w:val="ru-RU" w:eastAsia="en-US" w:bidi="ar-SA"/>
+      </w:rPr>
+    </w:lvl>
     <w:lvl w:ilvl="1">
       <w:start w:val="1"/>
       <w:numFmt w:val="decimal"/>
@@ -5215,7 +5779,7 @@
       </w:rPr>
     </w:lvl>
   </w:abstractNum>
-  <w:abstractNum w:abstractNumId="13" w15:restartNumberingAfterBreak="0">
+  <w:abstractNum w:abstractNumId="14" w15:restartNumberingAfterBreak="0">
     <w:nsid w:val="7CE94D9A"/>
     <w:multiLevelType w:val="hybridMultilevel"/>
     <w:tmpl w:val="130C06B6"/>
@@ -5304,7 +5868,7 @@
       </w:pPr>
     </w:lvl>
   </w:abstractNum>
-  <w:abstractNum w:abstractNumId="14" w15:restartNumberingAfterBreak="0">
+  <w:abstractNum w:abstractNumId="15" w15:restartNumberingAfterBreak="0">
     <w:nsid w:val="7D824A93"/>
     <w:multiLevelType w:val="hybridMultilevel"/>
     <w:tmpl w:val="83082D30"/>
@@ -5393,7 +5957,7 @@
       </w:pPr>
     </w:lvl>
   </w:abstractNum>
-  <w:abstractNum w:abstractNumId="15" w15:restartNumberingAfterBreak="0">
+  <w:abstractNum w:abstractNumId="16" w15:restartNumberingAfterBreak="0">
     <w:nsid w:val="7E4B4BD5"/>
     <w:multiLevelType w:val="hybridMultilevel"/>
     <w:tmpl w:val="F2265B52"/>
@@ -5483,40 +6047,40 @@
     </w:lvl>
   </w:abstractNum>
   <w:num w:numId="1" w16cid:durableId="1586188027">
-    <w:abstractNumId w:val="8"/>
+    <w:abstractNumId w:val="9"/>
   </w:num>
   <w:num w:numId="2" w16cid:durableId="976954538">
     <w:abstractNumId w:val="3"/>
   </w:num>
   <w:num w:numId="3" w16cid:durableId="79376324">
-    <w:abstractNumId w:val="9"/>
+    <w:abstractNumId w:val="10"/>
   </w:num>
   <w:num w:numId="4" w16cid:durableId="146553367">
-    <w:abstractNumId w:val="4"/>
+    <w:abstractNumId w:val="5"/>
   </w:num>
   <w:num w:numId="5" w16cid:durableId="593592315">
-    <w:abstractNumId w:val="13"/>
+    <w:abstractNumId w:val="14"/>
   </w:num>
   <w:num w:numId="6" w16cid:durableId="444809084">
-    <w:abstractNumId w:val="10"/>
+    <w:abstractNumId w:val="11"/>
   </w:num>
   <w:num w:numId="7" w16cid:durableId="1455440981">
-    <w:abstractNumId w:val="14"/>
+    <w:abstractNumId w:val="15"/>
   </w:num>
   <w:num w:numId="8" w16cid:durableId="907574375">
-    <w:abstractNumId w:val="5"/>
+    <w:abstractNumId w:val="6"/>
   </w:num>
   <w:num w:numId="9" w16cid:durableId="742601236">
-    <w:abstractNumId w:val="7"/>
+    <w:abstractNumId w:val="8"/>
   </w:num>
   <w:num w:numId="10" w16cid:durableId="529539489">
     <w:abstractNumId w:val="2"/>
   </w:num>
   <w:num w:numId="11" w16cid:durableId="1419328994">
-    <w:abstractNumId w:val="11"/>
+    <w:abstractNumId w:val="12"/>
   </w:num>
   <w:num w:numId="12" w16cid:durableId="405811273">
-    <w:abstractNumId w:val="6"/>
+    <w:abstractNumId w:val="7"/>
   </w:num>
   <w:num w:numId="13" w16cid:durableId="575896056">
     <w:abstractNumId w:val="1"/>
@@ -5525,10 +6089,13 @@
     <w:abstractNumId w:val="0"/>
   </w:num>
   <w:num w:numId="15" w16cid:durableId="226452415">
-    <w:abstractNumId w:val="15"/>
+    <w:abstractNumId w:val="16"/>
   </w:num>
   <w:num w:numId="16" w16cid:durableId="260527771">
-    <w:abstractNumId w:val="12"/>
+    <w:abstractNumId w:val="13"/>
+  </w:num>
+  <w:num w:numId="17" w16cid:durableId="1270284405">
+    <w:abstractNumId w:val="4"/>
   </w:num>
 </w:numbering>
 </file>

</xml_diff>

<commit_message>
vault backup: 2026-09-18 23:47:50
</commit_message>
<xml_diff>
--- a/Учеба 4 семестр/ОСИ/3 ЛАБ/Отчет.docx
+++ b/Учеба 4 семестр/ОСИ/3 ЛАБ/Отчет.docx
@@ -396,7 +396,7 @@
           <w:sz w:val="32"/>
           <w:szCs w:val="32"/>
         </w:rPr>
-        <w:t>1</w:t>
+        <w:t>3</w:t>
       </w:r>
     </w:p>
     <w:p>
@@ -755,22 +755,7 @@
           <w:szCs w:val="28"/>
         </w:rPr>
         <w:tab/>
-      </w:r>
-      <w:proofErr w:type="spellStart"/>
-      <w:r>
-        <w:rPr>
-          <w:sz w:val="28"/>
-          <w:szCs w:val="28"/>
-        </w:rPr>
-        <w:t>Гавва</w:t>
-      </w:r>
-      <w:proofErr w:type="spellEnd"/>
-      <w:r>
-        <w:rPr>
-          <w:sz w:val="28"/>
-          <w:szCs w:val="28"/>
-        </w:rPr>
-        <w:t xml:space="preserve"> Г.Д.</w:t>
+        <w:t>Гавва Г.Д.</w:t>
       </w:r>
     </w:p>
     <w:p>
@@ -976,7 +961,6 @@
         </w:rPr>
         <w:t>Реализовать программы: «Параллельное вычисление», «</w:t>
       </w:r>
-      <w:proofErr w:type="spellStart"/>
       <w:r>
         <w:rPr>
           <w:sz w:val="28"/>
@@ -984,14 +968,12 @@
         </w:rPr>
         <w:t>QuickSort</w:t>
       </w:r>
-      <w:proofErr w:type="spellEnd"/>
       <w:r>
         <w:rPr>
           <w:sz w:val="28"/>
         </w:rPr>
         <w:t>», «</w:t>
       </w:r>
-      <w:proofErr w:type="spellStart"/>
       <w:r>
         <w:rPr>
           <w:sz w:val="28"/>
@@ -999,7 +981,6 @@
         </w:rPr>
         <w:t>MergeSort</w:t>
       </w:r>
-      <w:proofErr w:type="spellEnd"/>
       <w:r>
         <w:rPr>
           <w:sz w:val="28"/>
@@ -1118,16 +1099,26 @@
         <w:rPr>
           <w:lang w:val="en-US"/>
         </w:rPr>
-        <w:t xml:space="preserve">Semaphore, </w:t>
-      </w:r>
-      <w:proofErr w:type="spellStart"/>
+        <w:t>Semaphore</w:t>
+      </w:r>
+      <w:r>
+        <w:t xml:space="preserve">, </w:t>
+      </w:r>
       <w:r>
         <w:rPr>
           <w:lang w:val="en-US"/>
         </w:rPr>
-        <w:t>Crit.section</w:t>
-      </w:r>
-      <w:proofErr w:type="spellEnd"/>
+        <w:t>Crit</w:t>
+      </w:r>
+      <w:r>
+        <w:t>.</w:t>
+      </w:r>
+      <w:r>
+        <w:rPr>
+          <w:lang w:val="en-US"/>
+        </w:rPr>
+        <w:t>section</w:t>
+      </w:r>
       <w:r>
         <w:t xml:space="preserve">. </w:t>
       </w:r>
@@ -1305,23 +1296,7 @@
         <w:t>Код Грея работает следующим образом: к</w:t>
       </w:r>
       <w:r>
-        <w:t xml:space="preserve">од Грея - просто число, полученное по формуле: </w:t>
-      </w:r>
-      <w:proofErr w:type="spellStart"/>
-      <w:r>
-        <w:t>index</w:t>
-      </w:r>
-      <w:proofErr w:type="spellEnd"/>
-      <w:r>
-        <w:t>(текущая задача) XOR (</w:t>
-      </w:r>
-      <w:proofErr w:type="spellStart"/>
-      <w:r>
-        <w:t>index</w:t>
-      </w:r>
-      <w:proofErr w:type="spellEnd"/>
-      <w:r>
-        <w:t>&gt;&gt;1). Постановка знака выполняется по следующим принципам:</w:t>
+        <w:t>од Грея - просто число, полученное по формуле: index(текущая задача) XOR (index&gt;&gt;1). Постановка знака выполняется по следующим принципам:</w:t>
       </w:r>
       <w:r>
         <w:rPr>
@@ -1417,6 +1392,9 @@
         <w:jc w:val="both"/>
       </w:pPr>
       <w:r>
+        <w:rPr>
+          <w:noProof/>
+        </w:rPr>
         <w:drawing>
           <wp:inline distT="0" distB="0" distL="0" distR="0" wp14:anchorId="57616207" wp14:editId="7F93EA9D">
             <wp:extent cx="5940425" cy="1903095"/>
@@ -1673,21 +1651,12 @@
               <w:ind w:right="163"/>
               <w:jc w:val="both"/>
             </w:pPr>
-            <w:proofErr w:type="spellStart"/>
             <w:r>
               <w:rPr>
                 <w:b/>
                 <w:bCs/>
               </w:rPr>
-              <w:t>main</w:t>
-            </w:r>
-            <w:proofErr w:type="spellEnd"/>
-            <w:r>
-              <w:rPr>
-                <w:b/>
-                <w:bCs/>
-              </w:rPr>
-              <w:t>()</w:t>
+              <w:t>main()</w:t>
             </w:r>
           </w:p>
         </w:tc>
@@ -1746,21 +1715,12 @@
               <w:ind w:right="163"/>
               <w:jc w:val="both"/>
             </w:pPr>
-            <w:proofErr w:type="spellStart"/>
             <w:r>
               <w:rPr>
                 <w:b/>
                 <w:bCs/>
               </w:rPr>
-              <w:t>open_file_and_scan</w:t>
-            </w:r>
-            <w:proofErr w:type="spellEnd"/>
-            <w:r>
-              <w:rPr>
-                <w:b/>
-                <w:bCs/>
-              </w:rPr>
-              <w:t>()</w:t>
+              <w:t>open_file_and_scan()</w:t>
             </w:r>
           </w:p>
         </w:tc>
@@ -1819,21 +1779,12 @@
               <w:ind w:right="163"/>
               <w:jc w:val="both"/>
             </w:pPr>
-            <w:proofErr w:type="spellStart"/>
             <w:r>
               <w:rPr>
                 <w:b/>
                 <w:bCs/>
               </w:rPr>
-              <w:t>time_to_file</w:t>
-            </w:r>
-            <w:proofErr w:type="spellEnd"/>
-            <w:r>
-              <w:rPr>
-                <w:b/>
-                <w:bCs/>
-              </w:rPr>
-              <w:t>()</w:t>
+              <w:t>time_to_file()</w:t>
             </w:r>
           </w:p>
         </w:tc>
@@ -1892,21 +1843,12 @@
               <w:ind w:right="163"/>
               <w:jc w:val="both"/>
             </w:pPr>
-            <w:proofErr w:type="spellStart"/>
             <w:r>
               <w:rPr>
                 <w:b/>
                 <w:bCs/>
               </w:rPr>
-              <w:t>result_to_file</w:t>
-            </w:r>
-            <w:proofErr w:type="spellEnd"/>
-            <w:r>
-              <w:rPr>
-                <w:b/>
-                <w:bCs/>
-              </w:rPr>
-              <w:t>()</w:t>
+              <w:t>result_to_file()</w:t>
             </w:r>
           </w:p>
         </w:tc>
@@ -1965,21 +1907,12 @@
               <w:ind w:right="163"/>
               <w:jc w:val="both"/>
             </w:pPr>
-            <w:proofErr w:type="spellStart"/>
             <w:r>
               <w:rPr>
                 <w:b/>
                 <w:bCs/>
               </w:rPr>
-              <w:t>total_combinations</w:t>
-            </w:r>
-            <w:proofErr w:type="spellEnd"/>
-            <w:r>
-              <w:rPr>
-                <w:b/>
-                <w:bCs/>
-              </w:rPr>
-              <w:t>()</w:t>
+              <w:t>total_combinations()</w:t>
             </w:r>
           </w:p>
         </w:tc>
@@ -2041,41 +1974,13 @@
                 <w:lang w:val="en-US"/>
               </w:rPr>
             </w:pPr>
-            <w:proofErr w:type="spellStart"/>
             <w:r>
               <w:rPr>
                 <w:b/>
                 <w:bCs/>
                 <w:lang w:val="en-US"/>
               </w:rPr>
-              <w:t>check_combination</w:t>
-            </w:r>
-            <w:proofErr w:type="spellEnd"/>
-            <w:r>
-              <w:rPr>
-                <w:b/>
-                <w:bCs/>
-                <w:lang w:val="en-US"/>
-              </w:rPr>
-              <w:t xml:space="preserve">(LL </w:t>
-            </w:r>
-            <w:proofErr w:type="spellStart"/>
-            <w:r>
-              <w:rPr>
-                <w:b/>
-                <w:bCs/>
-                <w:lang w:val="en-US"/>
-              </w:rPr>
-              <w:t>task_index</w:t>
-            </w:r>
-            <w:proofErr w:type="spellEnd"/>
-            <w:r>
-              <w:rPr>
-                <w:b/>
-                <w:bCs/>
-                <w:lang w:val="en-US"/>
-              </w:rPr>
-              <w:t>)</w:t>
+              <w:t>check_combination(LL task_index)</w:t>
             </w:r>
           </w:p>
         </w:tc>
@@ -2134,37 +2039,12 @@
               <w:ind w:right="163"/>
               <w:jc w:val="both"/>
             </w:pPr>
-            <w:proofErr w:type="spellStart"/>
             <w:r>
               <w:rPr>
                 <w:b/>
                 <w:bCs/>
               </w:rPr>
-              <w:t>worker_thread</w:t>
-            </w:r>
-            <w:proofErr w:type="spellEnd"/>
-            <w:r>
-              <w:rPr>
-                <w:b/>
-                <w:bCs/>
-              </w:rPr>
-              <w:t xml:space="preserve">(LPVOID </w:t>
-            </w:r>
-            <w:proofErr w:type="spellStart"/>
-            <w:r>
-              <w:rPr>
-                <w:b/>
-                <w:bCs/>
-              </w:rPr>
-              <w:t>param</w:t>
-            </w:r>
-            <w:proofErr w:type="spellEnd"/>
-            <w:r>
-              <w:rPr>
-                <w:b/>
-                <w:bCs/>
-              </w:rPr>
-              <w:t>)</w:t>
+              <w:t>worker_thread(LPVOID param)</w:t>
             </w:r>
           </w:p>
         </w:tc>
@@ -2226,41 +2106,13 @@
                 <w:lang w:val="en-US"/>
               </w:rPr>
             </w:pPr>
-            <w:proofErr w:type="spellStart"/>
             <w:r>
               <w:rPr>
                 <w:b/>
                 <w:bCs/>
                 <w:lang w:val="en-US"/>
               </w:rPr>
-              <w:t>number_of_digits</w:t>
-            </w:r>
-            <w:proofErr w:type="spellEnd"/>
-            <w:r>
-              <w:rPr>
-                <w:b/>
-                <w:bCs/>
-                <w:lang w:val="en-US"/>
-              </w:rPr>
-              <w:t xml:space="preserve">(LL </w:t>
-            </w:r>
-            <w:proofErr w:type="spellStart"/>
-            <w:r>
-              <w:rPr>
-                <w:b/>
-                <w:bCs/>
-                <w:lang w:val="en-US"/>
-              </w:rPr>
-              <w:t>task_index</w:t>
-            </w:r>
-            <w:proofErr w:type="spellEnd"/>
-            <w:r>
-              <w:rPr>
-                <w:b/>
-                <w:bCs/>
-                <w:lang w:val="en-US"/>
-              </w:rPr>
-              <w:t>)</w:t>
+              <w:t>number_of_digits(LL task_index)</w:t>
             </w:r>
           </w:p>
         </w:tc>
@@ -2391,31 +2243,21 @@
         <w:spacing w:before="183" w:line="309" w:lineRule="auto"/>
         <w:ind w:right="163"/>
       </w:pPr>
-      <w:proofErr w:type="spellStart"/>
       <w:r>
         <w:rPr>
           <w:lang w:val="en-US"/>
         </w:rPr>
         <w:t>QuickSort</w:t>
       </w:r>
-      <w:proofErr w:type="spellEnd"/>
-    </w:p>
-    <w:p>
-      <w:pPr>
-        <w:pStyle w:val="ac"/>
-        <w:spacing w:before="183" w:line="309" w:lineRule="auto"/>
-        <w:ind w:right="163"/>
-      </w:pPr>
-      <w:r>
-        <w:t xml:space="preserve">Программа должна выполнить многопоточную быструю сортировку массива целых чисел по </w:t>
-      </w:r>
-      <w:proofErr w:type="spellStart"/>
-      <w:r>
-        <w:t>возростанию</w:t>
-      </w:r>
-      <w:proofErr w:type="spellEnd"/>
-      <w:r>
-        <w:t>.</w:t>
+    </w:p>
+    <w:p>
+      <w:pPr>
+        <w:pStyle w:val="ac"/>
+        <w:spacing w:before="183" w:line="309" w:lineRule="auto"/>
+        <w:ind w:right="163"/>
+      </w:pPr>
+      <w:r>
+        <w:t>Программа должна выполнить многопоточную быструю сортировку массива целых чисел по возростанию.</w:t>
       </w:r>
     </w:p>
     <w:p>
@@ -2727,6 +2569,9 @@
         <w:ind w:left="720" w:right="163"/>
       </w:pPr>
       <w:r>
+        <w:rPr>
+          <w:noProof/>
+        </w:rPr>
         <w:lastRenderedPageBreak/>
         <w:drawing>
           <wp:inline distT="0" distB="0" distL="0" distR="0" wp14:anchorId="1C2BA934" wp14:editId="440A7EC9">
@@ -2802,19 +2647,11 @@
         <w:spacing w:before="183" w:line="309" w:lineRule="auto"/>
         <w:ind w:right="163"/>
       </w:pPr>
-      <w:proofErr w:type="spellStart"/>
       <w:r>
         <w:rPr>
           <w:lang w:val="en-US"/>
         </w:rPr>
-        <w:t>MergeSort</w:t>
-      </w:r>
-      <w:proofErr w:type="spellEnd"/>
-      <w:r>
-        <w:rPr>
-          <w:lang w:val="en-US"/>
-        </w:rPr>
-        <w:t xml:space="preserve"> </w:t>
+        <w:t xml:space="preserve">MergeSort </w:t>
       </w:r>
     </w:p>
     <w:p>
@@ -2901,14 +2738,12 @@
       <w:r>
         <w:t xml:space="preserve">Рисунок 7. Пример </w:t>
       </w:r>
-      <w:proofErr w:type="spellStart"/>
       <w:r>
         <w:rPr>
           <w:lang w:val="en-US"/>
         </w:rPr>
         <w:t>MergeSort</w:t>
       </w:r>
-      <w:proofErr w:type="spellEnd"/>
     </w:p>
     <w:p>
       <w:pPr>
@@ -2971,14 +2806,12 @@
       <w:r>
         <w:t xml:space="preserve"> и </w:t>
       </w:r>
-      <w:proofErr w:type="spellStart"/>
       <w:r>
         <w:rPr>
           <w:lang w:val="en-US"/>
         </w:rPr>
         <w:t>cond</w:t>
       </w:r>
-      <w:proofErr w:type="spellEnd"/>
       <w:r>
         <w:t xml:space="preserve">. </w:t>
       </w:r>
@@ -3369,15 +3202,7 @@
         <w:t xml:space="preserve"> </w:t>
       </w:r>
       <w:r>
-        <w:t>Изначально все философы находятся в состоянии "T" (</w:t>
-      </w:r>
-      <w:proofErr w:type="spellStart"/>
-      <w:r>
-        <w:t>Thinking</w:t>
-      </w:r>
-      <w:proofErr w:type="spellEnd"/>
-      <w:r>
-        <w:t xml:space="preserve">, "размышляет"). </w:t>
+        <w:t xml:space="preserve">Изначально все философы находятся в состоянии "T" (Thinking, "размышляет"). </w:t>
       </w:r>
     </w:p>
     <w:p>
@@ -3865,14 +3690,12 @@
       <w:r>
         <w:t xml:space="preserve">Нужно решить задачу по расстановке на шахматной доске размером </w:t>
       </w:r>
-      <w:proofErr w:type="spellStart"/>
       <w:r>
         <w:rPr>
           <w:lang w:val="en-US"/>
         </w:rPr>
         <w:t>NxN</w:t>
       </w:r>
-      <w:proofErr w:type="spellEnd"/>
       <w:r>
         <w:t xml:space="preserve"> </w:t>
       </w:r>
@@ -6714,6 +6537,7 @@
   <w:style w:type="character" w:default="1" w:styleId="a0">
     <w:name w:val="Default Paragraph Font"/>
     <w:uiPriority w:val="1"/>
+    <w:semiHidden/>
     <w:unhideWhenUsed/>
   </w:style>
   <w:style w:type="table" w:default="1" w:styleId="a1">

</xml_diff>